<commit_message>
kubernetes - architecture updated
</commit_message>
<xml_diff>
--- a/Kubernetes/2-architecture.docx
+++ b/Kubernetes/2-architecture.docx
@@ -4,6 +4,7 @@
   <w:body>
     <w:p>
       <w:pPr>
+        <w:spacing w:after="60"/>
         <w:jc w:val="both"/>
         <w:rPr>
           <w:rFonts w:asciiTheme="majorBidi" w:hAnsiTheme="majorBidi" w:cstheme="majorBidi"/>
@@ -22,6 +23,7 @@
     </w:p>
     <w:p>
       <w:pPr>
+        <w:spacing w:after="60"/>
         <w:jc w:val="both"/>
         <w:rPr>
           <w:rFonts w:asciiTheme="majorBidi" w:hAnsiTheme="majorBidi" w:cstheme="majorBidi"/>
@@ -49,13 +51,17 @@
         <w:jc w:val="both"/>
         <w:rPr>
           <w:rFonts w:asciiTheme="majorBidi" w:hAnsiTheme="majorBidi" w:cstheme="majorBidi"/>
-          <w:sz w:val="28"/>
-          <w:szCs w:val="28"/>
-        </w:rPr>
-      </w:pPr>
-      <w:r>
-        <w:rPr>
-          <w:rFonts w:asciiTheme="majorBidi" w:hAnsiTheme="majorBidi" w:cstheme="majorBidi"/>
+          <w:b/>
+          <w:bCs/>
+          <w:sz w:val="28"/>
+          <w:szCs w:val="28"/>
+        </w:rPr>
+      </w:pPr>
+      <w:r>
+        <w:rPr>
+          <w:rFonts w:asciiTheme="majorBidi" w:hAnsiTheme="majorBidi" w:cstheme="majorBidi"/>
+          <w:b/>
+          <w:bCs/>
           <w:sz w:val="28"/>
           <w:szCs w:val="28"/>
         </w:rPr>
@@ -69,17 +75,22 @@
           <w:ilvl w:val="0"/>
           <w:numId w:val="1"/>
         </w:numPr>
+        <w:spacing w:after="60"/>
         <w:ind w:left="360"/>
         <w:jc w:val="both"/>
         <w:rPr>
           <w:rFonts w:asciiTheme="majorBidi" w:hAnsiTheme="majorBidi" w:cstheme="majorBidi"/>
-          <w:sz w:val="28"/>
-          <w:szCs w:val="28"/>
-        </w:rPr>
-      </w:pPr>
-      <w:r>
-        <w:rPr>
-          <w:rFonts w:asciiTheme="majorBidi" w:hAnsiTheme="majorBidi" w:cstheme="majorBidi"/>
+          <w:b/>
+          <w:bCs/>
+          <w:sz w:val="28"/>
+          <w:szCs w:val="28"/>
+        </w:rPr>
+      </w:pPr>
+      <w:r>
+        <w:rPr>
+          <w:rFonts w:asciiTheme="majorBidi" w:hAnsiTheme="majorBidi" w:cstheme="majorBidi"/>
+          <w:b/>
+          <w:bCs/>
           <w:sz w:val="28"/>
           <w:szCs w:val="28"/>
         </w:rPr>
@@ -88,6 +99,7 @@
     </w:p>
     <w:p>
       <w:pPr>
+        <w:spacing w:after="120"/>
         <w:jc w:val="both"/>
         <w:rPr>
           <w:rFonts w:asciiTheme="majorBidi" w:hAnsiTheme="majorBidi" w:cstheme="majorBidi"/>
@@ -103,16 +115,14 @@
         </w:rPr>
         <w:t>The control plane manages the cluster, while worker nodes run the actual application workloads.</w:t>
       </w:r>
-    </w:p>
-    <w:p>
-      <w:pPr>
-        <w:jc w:val="both"/>
-        <w:rPr>
-          <w:rFonts w:asciiTheme="majorBidi" w:hAnsiTheme="majorBidi" w:cstheme="majorBidi"/>
-          <w:sz w:val="28"/>
-          <w:szCs w:val="28"/>
-        </w:rPr>
-      </w:pPr>
+      <w:r>
+        <w:rPr>
+          <w:rFonts w:asciiTheme="majorBidi" w:hAnsiTheme="majorBidi" w:cstheme="majorBidi"/>
+          <w:sz w:val="28"/>
+          <w:szCs w:val="28"/>
+        </w:rPr>
+        <w:t xml:space="preserve"> </w:t>
+      </w:r>
       <w:r>
         <w:rPr>
           <w:rFonts w:asciiTheme="majorBidi" w:hAnsiTheme="majorBidi" w:cstheme="majorBidi"/>
@@ -124,6 +134,7 @@
     </w:p>
     <w:p>
       <w:pPr>
+        <w:spacing w:after="120"/>
         <w:jc w:val="both"/>
         <w:rPr>
           <w:rFonts w:asciiTheme="majorBidi" w:hAnsiTheme="majorBidi" w:cstheme="majorBidi"/>
@@ -146,6 +157,7 @@
     </w:p>
     <w:p>
       <w:pPr>
+        <w:spacing w:after="60"/>
         <w:jc w:val="both"/>
         <w:rPr>
           <w:rFonts w:asciiTheme="majorBidi" w:hAnsiTheme="majorBidi" w:cstheme="majorBidi"/>
@@ -257,6 +269,7 @@
           <w:ilvl w:val="0"/>
           <w:numId w:val="2"/>
         </w:numPr>
+        <w:spacing w:after="120"/>
         <w:ind w:left="360"/>
         <w:jc w:val="both"/>
         <w:rPr>
@@ -276,6 +289,7 @@
     </w:p>
     <w:p>
       <w:pPr>
+        <w:spacing w:after="60"/>
         <w:jc w:val="both"/>
         <w:rPr>
           <w:rFonts w:asciiTheme="majorBidi" w:hAnsiTheme="majorBidi" w:cstheme="majorBidi"/>
@@ -307,6 +321,8 @@
         <w:jc w:val="both"/>
         <w:rPr>
           <w:rFonts w:asciiTheme="majorBidi" w:hAnsiTheme="majorBidi" w:cstheme="majorBidi"/>
+          <w:b/>
+          <w:bCs/>
           <w:sz w:val="28"/>
           <w:szCs w:val="28"/>
         </w:rPr>
@@ -315,6 +331,8 @@
       <w:r>
         <w:rPr>
           <w:rFonts w:asciiTheme="majorBidi" w:hAnsiTheme="majorBidi" w:cstheme="majorBidi"/>
+          <w:b/>
+          <w:bCs/>
           <w:sz w:val="28"/>
           <w:szCs w:val="28"/>
         </w:rPr>
@@ -333,6 +351,8 @@
         <w:jc w:val="both"/>
         <w:rPr>
           <w:rFonts w:asciiTheme="majorBidi" w:hAnsiTheme="majorBidi" w:cstheme="majorBidi"/>
+          <w:b/>
+          <w:bCs/>
           <w:sz w:val="28"/>
           <w:szCs w:val="28"/>
         </w:rPr>
@@ -341,6 +361,8 @@
       <w:r>
         <w:rPr>
           <w:rFonts w:asciiTheme="majorBidi" w:hAnsiTheme="majorBidi" w:cstheme="majorBidi"/>
+          <w:b/>
+          <w:bCs/>
           <w:sz w:val="28"/>
           <w:szCs w:val="28"/>
         </w:rPr>
@@ -359,6 +381,8 @@
         <w:jc w:val="both"/>
         <w:rPr>
           <w:rFonts w:asciiTheme="majorBidi" w:hAnsiTheme="majorBidi" w:cstheme="majorBidi"/>
+          <w:b/>
+          <w:bCs/>
           <w:sz w:val="28"/>
           <w:szCs w:val="28"/>
         </w:rPr>
@@ -367,6 +391,8 @@
       <w:r>
         <w:rPr>
           <w:rFonts w:asciiTheme="majorBidi" w:hAnsiTheme="majorBidi" w:cstheme="majorBidi"/>
+          <w:b/>
+          <w:bCs/>
           <w:sz w:val="28"/>
           <w:szCs w:val="28"/>
         </w:rPr>
@@ -376,6 +402,8 @@
       <w:r>
         <w:rPr>
           <w:rFonts w:asciiTheme="majorBidi" w:hAnsiTheme="majorBidi" w:cstheme="majorBidi"/>
+          <w:b/>
+          <w:bCs/>
           <w:sz w:val="28"/>
           <w:szCs w:val="28"/>
         </w:rPr>
@@ -393,6 +421,8 @@
         <w:jc w:val="both"/>
         <w:rPr>
           <w:rFonts w:asciiTheme="majorBidi" w:hAnsiTheme="majorBidi" w:cstheme="majorBidi"/>
+          <w:b/>
+          <w:bCs/>
           <w:sz w:val="28"/>
           <w:szCs w:val="28"/>
         </w:rPr>
@@ -401,6 +431,8 @@
       <w:r>
         <w:rPr>
           <w:rFonts w:asciiTheme="majorBidi" w:hAnsiTheme="majorBidi" w:cstheme="majorBidi"/>
+          <w:b/>
+          <w:bCs/>
           <w:sz w:val="28"/>
           <w:szCs w:val="28"/>
         </w:rPr>
@@ -410,6 +442,8 @@
       <w:r>
         <w:rPr>
           <w:rFonts w:asciiTheme="majorBidi" w:hAnsiTheme="majorBidi" w:cstheme="majorBidi"/>
+          <w:b/>
+          <w:bCs/>
           <w:sz w:val="28"/>
           <w:szCs w:val="28"/>
         </w:rPr>
@@ -423,17 +457,22 @@
           <w:ilvl w:val="0"/>
           <w:numId w:val="3"/>
         </w:numPr>
+        <w:spacing w:after="120"/>
         <w:ind w:left="360"/>
         <w:jc w:val="both"/>
         <w:rPr>
           <w:rFonts w:asciiTheme="majorBidi" w:hAnsiTheme="majorBidi" w:cstheme="majorBidi"/>
-          <w:sz w:val="28"/>
-          <w:szCs w:val="28"/>
-        </w:rPr>
-      </w:pPr>
-      <w:r>
-        <w:rPr>
-          <w:rFonts w:asciiTheme="majorBidi" w:hAnsiTheme="majorBidi" w:cstheme="majorBidi"/>
+          <w:b/>
+          <w:bCs/>
+          <w:sz w:val="28"/>
+          <w:szCs w:val="28"/>
+        </w:rPr>
+      </w:pPr>
+      <w:r>
+        <w:rPr>
+          <w:rFonts w:asciiTheme="majorBidi" w:hAnsiTheme="majorBidi" w:cstheme="majorBidi"/>
+          <w:b/>
+          <w:bCs/>
           <w:sz w:val="28"/>
           <w:szCs w:val="28"/>
         </w:rPr>
@@ -442,13 +481,14 @@
     </w:p>
     <w:p>
       <w:pPr>
-        <w:jc w:val="both"/>
-        <w:rPr>
-          <w:rFonts w:asciiTheme="majorBidi" w:hAnsiTheme="majorBidi" w:cstheme="majorBidi"/>
-          <w:b/>
-          <w:bCs/>
-          <w:sz w:val="32"/>
-          <w:szCs w:val="32"/>
+        <w:spacing w:after="120"/>
+        <w:jc w:val="both"/>
+        <w:rPr>
+          <w:rFonts w:asciiTheme="majorBidi" w:hAnsiTheme="majorBidi" w:cstheme="majorBidi"/>
+          <w:b/>
+          <w:bCs/>
+          <w:sz w:val="36"/>
+          <w:szCs w:val="36"/>
         </w:rPr>
       </w:pPr>
       <w:proofErr w:type="spellStart"/>
@@ -457,8 +497,8 @@
           <w:rFonts w:asciiTheme="majorBidi" w:hAnsiTheme="majorBidi" w:cstheme="majorBidi"/>
           <w:b/>
           <w:bCs/>
-          <w:sz w:val="32"/>
-          <w:szCs w:val="32"/>
+          <w:sz w:val="36"/>
+          <w:szCs w:val="36"/>
         </w:rPr>
         <w:t>kube-apiserver</w:t>
       </w:r>
@@ -468,14 +508,15 @@
           <w:rFonts w:asciiTheme="majorBidi" w:hAnsiTheme="majorBidi" w:cstheme="majorBidi"/>
           <w:b/>
           <w:bCs/>
-          <w:sz w:val="32"/>
-          <w:szCs w:val="32"/>
+          <w:sz w:val="36"/>
+          <w:szCs w:val="36"/>
         </w:rPr>
         <w:t>:</w:t>
       </w:r>
     </w:p>
     <w:p>
       <w:pPr>
+        <w:spacing w:after="60"/>
         <w:jc w:val="both"/>
         <w:rPr>
           <w:rFonts w:asciiTheme="majorBidi" w:hAnsiTheme="majorBidi" w:cstheme="majorBidi"/>
@@ -520,6 +561,7 @@
           <w:rFonts w:asciiTheme="majorBidi" w:hAnsiTheme="majorBidi" w:cstheme="majorBidi"/>
           <w:sz w:val="28"/>
           <w:szCs w:val="28"/>
+          <w:u w:val="single"/>
         </w:rPr>
         <w:t>Examples:</w:t>
       </w:r>
@@ -543,6 +585,10 @@
       <w:r>
         <w:rPr>
           <w:rFonts w:asciiTheme="majorBidi" w:hAnsiTheme="majorBidi" w:cstheme="majorBidi"/>
+          <w:b/>
+          <w:bCs/>
+          <w:i/>
+          <w:iCs/>
           <w:sz w:val="28"/>
           <w:szCs w:val="28"/>
         </w:rPr>
@@ -552,10 +598,22 @@
       <w:r>
         <w:rPr>
           <w:rFonts w:asciiTheme="majorBidi" w:hAnsiTheme="majorBidi" w:cstheme="majorBidi"/>
-          <w:sz w:val="28"/>
-          <w:szCs w:val="28"/>
-        </w:rPr>
-        <w:t xml:space="preserve"> commands</w:t>
+          <w:b/>
+          <w:bCs/>
+          <w:i/>
+          <w:iCs/>
+          <w:sz w:val="28"/>
+          <w:szCs w:val="28"/>
+        </w:rPr>
+        <w:t xml:space="preserve"> </w:t>
+      </w:r>
+      <w:r>
+        <w:rPr>
+          <w:rFonts w:asciiTheme="majorBidi" w:hAnsiTheme="majorBidi" w:cstheme="majorBidi"/>
+          <w:sz w:val="28"/>
+          <w:szCs w:val="28"/>
+        </w:rPr>
+        <w:t>commands</w:t>
       </w:r>
     </w:p>
     <w:p>
@@ -613,6 +671,7 @@
           <w:ilvl w:val="0"/>
           <w:numId w:val="4"/>
         </w:numPr>
+        <w:spacing w:after="120"/>
         <w:ind w:left="360"/>
         <w:jc w:val="both"/>
         <w:rPr>
@@ -632,16 +691,21 @@
     </w:p>
     <w:p>
       <w:pPr>
-        <w:jc w:val="both"/>
-        <w:rPr>
-          <w:rFonts w:asciiTheme="majorBidi" w:hAnsiTheme="majorBidi" w:cstheme="majorBidi"/>
-          <w:sz w:val="28"/>
-          <w:szCs w:val="28"/>
-        </w:rPr>
-      </w:pPr>
-      <w:r>
-        <w:rPr>
-          <w:rFonts w:asciiTheme="majorBidi" w:hAnsiTheme="majorBidi" w:cstheme="majorBidi"/>
+        <w:spacing w:after="60"/>
+        <w:jc w:val="both"/>
+        <w:rPr>
+          <w:rFonts w:asciiTheme="majorBidi" w:hAnsiTheme="majorBidi" w:cstheme="majorBidi"/>
+          <w:b/>
+          <w:bCs/>
+          <w:sz w:val="28"/>
+          <w:szCs w:val="28"/>
+        </w:rPr>
+      </w:pPr>
+      <w:r>
+        <w:rPr>
+          <w:rFonts w:asciiTheme="majorBidi" w:hAnsiTheme="majorBidi" w:cstheme="majorBidi"/>
+          <w:b/>
+          <w:bCs/>
           <w:sz w:val="28"/>
           <w:szCs w:val="28"/>
         </w:rPr>
@@ -727,6 +791,7 @@
           <w:ilvl w:val="0"/>
           <w:numId w:val="5"/>
         </w:numPr>
+        <w:spacing w:after="120"/>
         <w:ind w:left="360"/>
         <w:jc w:val="both"/>
         <w:rPr>
@@ -756,6 +821,7 @@
     </w:p>
     <w:p>
       <w:pPr>
+        <w:spacing w:after="60"/>
         <w:jc w:val="both"/>
         <w:rPr>
           <w:rFonts w:asciiTheme="majorBidi" w:hAnsiTheme="majorBidi" w:cstheme="majorBidi"/>
@@ -771,7 +837,6 @@
           <w:szCs w:val="28"/>
           <w:u w:val="single"/>
         </w:rPr>
-        <w:lastRenderedPageBreak/>
         <w:t>Example request flow:</w:t>
       </w:r>
     </w:p>
@@ -846,6 +911,8 @@
       <w:r>
         <w:rPr>
           <w:rFonts w:asciiTheme="majorBidi" w:hAnsiTheme="majorBidi" w:cstheme="majorBidi"/>
+          <w:b/>
+          <w:bCs/>
           <w:sz w:val="28"/>
           <w:szCs w:val="28"/>
         </w:rPr>
@@ -880,6 +947,8 @@
       <w:r>
         <w:rPr>
           <w:rFonts w:asciiTheme="majorBidi" w:hAnsiTheme="majorBidi" w:cstheme="majorBidi"/>
+          <w:b/>
+          <w:bCs/>
           <w:sz w:val="28"/>
           <w:szCs w:val="28"/>
         </w:rPr>
@@ -909,12 +978,29 @@
           <w:sz w:val="28"/>
           <w:szCs w:val="28"/>
         </w:rPr>
-        <w:t xml:space="preserve">In Docker, almost every operation ultimately goes through the Docker Engine’s REST API. The Docker CLI is essentially a client for that API. For example, when a user runs docker </w:t>
+        <w:lastRenderedPageBreak/>
+        <w:t xml:space="preserve">In Docker, almost every operation ultimately goes through the Docker Engine’s REST API. The Docker CLI is essentially a client for that API. For example, when a user runs </w:t>
+      </w:r>
+      <w:r>
+        <w:rPr>
+          <w:rFonts w:asciiTheme="majorBidi" w:hAnsiTheme="majorBidi" w:cstheme="majorBidi"/>
+          <w:b/>
+          <w:bCs/>
+          <w:i/>
+          <w:iCs/>
+          <w:sz w:val="28"/>
+          <w:szCs w:val="28"/>
+        </w:rPr>
+        <w:t xml:space="preserve">docker </w:t>
       </w:r>
       <w:proofErr w:type="spellStart"/>
       <w:r>
         <w:rPr>
           <w:rFonts w:asciiTheme="majorBidi" w:hAnsiTheme="majorBidi" w:cstheme="majorBidi"/>
+          <w:b/>
+          <w:bCs/>
+          <w:i/>
+          <w:iCs/>
           <w:sz w:val="28"/>
           <w:szCs w:val="28"/>
         </w:rPr>
@@ -927,12 +1013,28 @@
           <w:sz w:val="28"/>
           <w:szCs w:val="28"/>
         </w:rPr>
-        <w:t>, the CLI sends an HTTP GET request to the Docker daemon through its REST API (usually via a Unix socket such as /var/run/</w:t>
+        <w:t xml:space="preserve">, the CLI sends an HTTP GET request to the Docker daemon through its REST API (usually via a Unix socket such as </w:t>
+      </w:r>
+      <w:r>
+        <w:rPr>
+          <w:rFonts w:asciiTheme="majorBidi" w:hAnsiTheme="majorBidi" w:cstheme="majorBidi"/>
+          <w:b/>
+          <w:bCs/>
+          <w:i/>
+          <w:iCs/>
+          <w:sz w:val="28"/>
+          <w:szCs w:val="28"/>
+        </w:rPr>
+        <w:t>/var/run/</w:t>
       </w:r>
       <w:proofErr w:type="spellStart"/>
       <w:r>
         <w:rPr>
           <w:rFonts w:asciiTheme="majorBidi" w:hAnsiTheme="majorBidi" w:cstheme="majorBidi"/>
+          <w:b/>
+          <w:bCs/>
+          <w:i/>
+          <w:iCs/>
           <w:sz w:val="28"/>
           <w:szCs w:val="28"/>
         </w:rPr>
@@ -971,6 +1073,8 @@
       <w:r>
         <w:rPr>
           <w:rFonts w:asciiTheme="majorBidi" w:hAnsiTheme="majorBidi" w:cstheme="majorBidi"/>
+          <w:b/>
+          <w:bCs/>
           <w:sz w:val="28"/>
           <w:szCs w:val="28"/>
         </w:rPr>
@@ -989,6 +1093,10 @@
       <w:r>
         <w:rPr>
           <w:rFonts w:asciiTheme="majorBidi" w:hAnsiTheme="majorBidi" w:cstheme="majorBidi"/>
+          <w:b/>
+          <w:bCs/>
+          <w:i/>
+          <w:iCs/>
           <w:sz w:val="28"/>
           <w:szCs w:val="28"/>
         </w:rPr>
@@ -1007,6 +1115,10 @@
       <w:r>
         <w:rPr>
           <w:rFonts w:asciiTheme="majorBidi" w:hAnsiTheme="majorBidi" w:cstheme="majorBidi"/>
+          <w:b/>
+          <w:bCs/>
+          <w:i/>
+          <w:iCs/>
           <w:sz w:val="28"/>
           <w:szCs w:val="28"/>
         </w:rPr>
@@ -1016,15 +1128,29 @@
       <w:r>
         <w:rPr>
           <w:rFonts w:asciiTheme="majorBidi" w:hAnsiTheme="majorBidi" w:cstheme="majorBidi"/>
-          <w:sz w:val="28"/>
-          <w:szCs w:val="28"/>
-        </w:rPr>
-        <w:t xml:space="preserve"> get pods, the CLI sends a request to the API server asking for Pod resources. The API server validates the request, retrieves the desired information from </w:t>
+          <w:b/>
+          <w:bCs/>
+          <w:i/>
+          <w:iCs/>
+          <w:sz w:val="28"/>
+          <w:szCs w:val="28"/>
+        </w:rPr>
+        <w:t xml:space="preserve"> get pods</w:t>
+      </w:r>
+      <w:r>
+        <w:rPr>
+          <w:rFonts w:asciiTheme="majorBidi" w:hAnsiTheme="majorBidi" w:cstheme="majorBidi"/>
+          <w:sz w:val="28"/>
+          <w:szCs w:val="28"/>
+        </w:rPr>
+        <w:t xml:space="preserve">, the CLI sends a request to the API server asking for Pod resources. The API server validates the request, retrieves the desired information from </w:t>
       </w:r>
       <w:proofErr w:type="spellStart"/>
       <w:r>
         <w:rPr>
           <w:rFonts w:asciiTheme="majorBidi" w:hAnsiTheme="majorBidi" w:cstheme="majorBidi"/>
+          <w:b/>
+          <w:bCs/>
           <w:sz w:val="28"/>
           <w:szCs w:val="28"/>
         </w:rPr>
@@ -1057,12 +1183,50 @@
           <w:sz w:val="28"/>
           <w:szCs w:val="28"/>
         </w:rPr>
-        <w:t xml:space="preserve">The API server is also the central communication hub for internal Kubernetes components. Core components such as the scheduler, controller manager, and </w:t>
+        <w:t xml:space="preserve">The API server is also the central communication hub for internal Kubernetes components. Core components such as the </w:t>
+      </w:r>
+      <w:r>
+        <w:rPr>
+          <w:rFonts w:asciiTheme="majorBidi" w:hAnsiTheme="majorBidi" w:cstheme="majorBidi"/>
+          <w:b/>
+          <w:bCs/>
+          <w:sz w:val="28"/>
+          <w:szCs w:val="28"/>
+        </w:rPr>
+        <w:t>scheduler</w:t>
+      </w:r>
+      <w:r>
+        <w:rPr>
+          <w:rFonts w:asciiTheme="majorBidi" w:hAnsiTheme="majorBidi" w:cstheme="majorBidi"/>
+          <w:sz w:val="28"/>
+          <w:szCs w:val="28"/>
+        </w:rPr>
+        <w:t xml:space="preserve">, </w:t>
+      </w:r>
+      <w:r>
+        <w:rPr>
+          <w:rFonts w:asciiTheme="majorBidi" w:hAnsiTheme="majorBidi" w:cstheme="majorBidi"/>
+          <w:b/>
+          <w:bCs/>
+          <w:sz w:val="28"/>
+          <w:szCs w:val="28"/>
+        </w:rPr>
+        <w:t>controller manager</w:t>
+      </w:r>
+      <w:r>
+        <w:rPr>
+          <w:rFonts w:asciiTheme="majorBidi" w:hAnsiTheme="majorBidi" w:cstheme="majorBidi"/>
+          <w:sz w:val="28"/>
+          <w:szCs w:val="28"/>
+        </w:rPr>
+        <w:t xml:space="preserve">, and </w:t>
       </w:r>
       <w:proofErr w:type="spellStart"/>
       <w:r>
         <w:rPr>
           <w:rFonts w:asciiTheme="majorBidi" w:hAnsiTheme="majorBidi" w:cstheme="majorBidi"/>
+          <w:b/>
+          <w:bCs/>
           <w:sz w:val="28"/>
           <w:szCs w:val="28"/>
         </w:rPr>
@@ -1093,7 +1257,27 @@
           <w:sz w:val="28"/>
           <w:szCs w:val="28"/>
         </w:rPr>
-        <w:t xml:space="preserve"> via the API server. The scheduler watches the API for unscheduled Pods, selects an appropriate node, and writes that decision back through the API server. The </w:t>
+        <w:t xml:space="preserve"> via the API server. The </w:t>
+      </w:r>
+      <w:r>
+        <w:rPr>
+          <w:rFonts w:asciiTheme="majorBidi" w:hAnsiTheme="majorBidi" w:cstheme="majorBidi"/>
+          <w:b/>
+          <w:bCs/>
+          <w:i/>
+          <w:iCs/>
+          <w:sz w:val="28"/>
+          <w:szCs w:val="28"/>
+        </w:rPr>
+        <w:t>scheduler</w:t>
+      </w:r>
+      <w:r>
+        <w:rPr>
+          <w:rFonts w:asciiTheme="majorBidi" w:hAnsiTheme="majorBidi" w:cstheme="majorBidi"/>
+          <w:sz w:val="28"/>
+          <w:szCs w:val="28"/>
+        </w:rPr>
+        <w:t xml:space="preserve"> watches the API for unscheduled Pods, selects an appropriate node, and writes that decision back through the API server. The </w:t>
       </w:r>
       <w:proofErr w:type="spellStart"/>
       <w:r>
@@ -1116,6 +1300,7 @@
     </w:p>
     <w:p>
       <w:pPr>
+        <w:spacing w:after="120"/>
         <w:ind w:left="360"/>
         <w:jc w:val="both"/>
         <w:rPr>
@@ -1138,19 +1323,44 @@
           <w:sz w:val="28"/>
           <w:szCs w:val="28"/>
         </w:rPr>
-        <w:t xml:space="preserve"> - </w:t>
-      </w:r>
-      <w:r>
-        <w:rPr>
-          <w:rFonts w:asciiTheme="majorBidi" w:hAnsiTheme="majorBidi" w:cstheme="majorBidi"/>
-          <w:sz w:val="28"/>
-          <w:szCs w:val="28"/>
-        </w:rPr>
-        <w:t>whether from users, tools, or internal components—is expressed as an API request that reads or modifies the cluster’s desired state. This API‑driven architecture is what enables Kubernetes to be extensible, observable, and controllable by a wide variety of clients and automation systems.</w:t>
-      </w:r>
-    </w:p>
-    <w:p>
-      <w:pPr>
+        <w:t>,</w:t>
+      </w:r>
+      <w:r>
+        <w:rPr>
+          <w:rFonts w:asciiTheme="majorBidi" w:hAnsiTheme="majorBidi" w:cstheme="majorBidi"/>
+          <w:sz w:val="28"/>
+          <w:szCs w:val="28"/>
+        </w:rPr>
+        <w:t xml:space="preserve"> </w:t>
+      </w:r>
+      <w:r>
+        <w:rPr>
+          <w:rFonts w:asciiTheme="majorBidi" w:hAnsiTheme="majorBidi" w:cstheme="majorBidi"/>
+          <w:sz w:val="28"/>
+          <w:szCs w:val="28"/>
+        </w:rPr>
+        <w:t>whether from users, tools, or internal components</w:t>
+      </w:r>
+      <w:r>
+        <w:rPr>
+          <w:rFonts w:asciiTheme="majorBidi" w:hAnsiTheme="majorBidi" w:cstheme="majorBidi"/>
+          <w:sz w:val="28"/>
+          <w:szCs w:val="28"/>
+        </w:rPr>
+        <w:t xml:space="preserve">, </w:t>
+      </w:r>
+      <w:r>
+        <w:rPr>
+          <w:rFonts w:asciiTheme="majorBidi" w:hAnsiTheme="majorBidi" w:cstheme="majorBidi"/>
+          <w:sz w:val="28"/>
+          <w:szCs w:val="28"/>
+        </w:rPr>
+        <w:t>is expressed as an API request that reads or modifies the cluster’s desired state. This API‑driven architecture is what enables Kubernetes to be extensible, observable, and controllable by a wide variety of clients and automation systems.</w:t>
+      </w:r>
+    </w:p>
+    <w:p>
+      <w:pPr>
+        <w:spacing w:after="120"/>
         <w:jc w:val="both"/>
         <w:rPr>
           <w:rFonts w:asciiTheme="majorBidi" w:hAnsiTheme="majorBidi" w:cstheme="majorBidi"/>
@@ -1185,6 +1395,7 @@
     </w:p>
     <w:p>
       <w:pPr>
+        <w:spacing w:after="60"/>
         <w:jc w:val="both"/>
         <w:rPr>
           <w:rFonts w:asciiTheme="majorBidi" w:hAnsiTheme="majorBidi" w:cstheme="majorBidi"/>
@@ -1308,6 +1519,7 @@
           <w:ilvl w:val="0"/>
           <w:numId w:val="6"/>
         </w:numPr>
+        <w:spacing w:after="120"/>
         <w:ind w:left="360"/>
         <w:jc w:val="both"/>
         <w:rPr>
@@ -1327,24 +1539,24 @@
     </w:p>
     <w:p>
       <w:pPr>
-        <w:jc w:val="both"/>
-        <w:rPr>
-          <w:rFonts w:asciiTheme="majorBidi" w:hAnsiTheme="majorBidi" w:cstheme="majorBidi"/>
-          <w:b/>
-          <w:bCs/>
-          <w:sz w:val="28"/>
-          <w:szCs w:val="28"/>
-        </w:rPr>
-      </w:pPr>
-      <w:r>
-        <w:rPr>
-          <w:rFonts w:asciiTheme="majorBidi" w:hAnsiTheme="majorBidi" w:cstheme="majorBidi"/>
-          <w:b/>
-          <w:bCs/>
-          <w:sz w:val="28"/>
-          <w:szCs w:val="28"/>
-        </w:rPr>
-        <w:lastRenderedPageBreak/>
+        <w:spacing w:after="60"/>
+        <w:jc w:val="both"/>
+        <w:rPr>
+          <w:rFonts w:asciiTheme="majorBidi" w:hAnsiTheme="majorBidi" w:cstheme="majorBidi"/>
+          <w:b/>
+          <w:bCs/>
+          <w:sz w:val="28"/>
+          <w:szCs w:val="28"/>
+        </w:rPr>
+      </w:pPr>
+      <w:r>
+        <w:rPr>
+          <w:rFonts w:asciiTheme="majorBidi" w:hAnsiTheme="majorBidi" w:cstheme="majorBidi"/>
+          <w:b/>
+          <w:bCs/>
+          <w:sz w:val="28"/>
+          <w:szCs w:val="28"/>
+        </w:rPr>
         <w:t>Characteristics:</w:t>
       </w:r>
     </w:p>
@@ -1418,6 +1630,7 @@
           <w:sz w:val="28"/>
           <w:szCs w:val="28"/>
         </w:rPr>
+        <w:lastRenderedPageBreak/>
         <w:t>highly available</w:t>
       </w:r>
     </w:p>
@@ -1453,6 +1666,8 @@
       <w:r>
         <w:rPr>
           <w:rFonts w:asciiTheme="majorBidi" w:hAnsiTheme="majorBidi" w:cstheme="majorBidi"/>
+          <w:b/>
+          <w:bCs/>
           <w:sz w:val="28"/>
           <w:szCs w:val="28"/>
         </w:rPr>
@@ -1491,7 +1706,15 @@
           <w:sz w:val="28"/>
           <w:szCs w:val="28"/>
         </w:rPr>
-        <w:t xml:space="preserve"> - </w:t>
+        <w:t>,</w:t>
+      </w:r>
+      <w:r>
+        <w:rPr>
+          <w:rFonts w:asciiTheme="majorBidi" w:hAnsiTheme="majorBidi" w:cstheme="majorBidi"/>
+          <w:sz w:val="28"/>
+          <w:szCs w:val="28"/>
+        </w:rPr>
+        <w:t xml:space="preserve"> </w:t>
       </w:r>
       <w:r>
         <w:rPr>
@@ -1517,15 +1740,43 @@
           <w:sz w:val="28"/>
           <w:szCs w:val="28"/>
         </w:rPr>
-        <w:t xml:space="preserve"> Nginx Pod with specific replicas, container images, volumes, or other configuration</w:t>
-      </w:r>
-      <w:r>
-        <w:rPr>
-          <w:rFonts w:asciiTheme="majorBidi" w:hAnsiTheme="majorBidi" w:cstheme="majorBidi"/>
-          <w:sz w:val="28"/>
-          <w:szCs w:val="28"/>
-        </w:rPr>
-        <w:t xml:space="preserve"> - </w:t>
+        <w:t xml:space="preserve"> Nginx Pod with specific </w:t>
+      </w:r>
+      <w:r>
+        <w:rPr>
+          <w:rFonts w:asciiTheme="majorBidi" w:hAnsiTheme="majorBidi" w:cstheme="majorBidi"/>
+          <w:b/>
+          <w:bCs/>
+          <w:i/>
+          <w:iCs/>
+          <w:sz w:val="28"/>
+          <w:szCs w:val="28"/>
+        </w:rPr>
+        <w:t>replicas</w:t>
+      </w:r>
+      <w:r>
+        <w:rPr>
+          <w:rFonts w:asciiTheme="majorBidi" w:hAnsiTheme="majorBidi" w:cstheme="majorBidi"/>
+          <w:sz w:val="28"/>
+          <w:szCs w:val="28"/>
+        </w:rPr>
+        <w:t>, container images, volumes, or other configuration</w:t>
+      </w:r>
+      <w:r>
+        <w:rPr>
+          <w:rFonts w:asciiTheme="majorBidi" w:hAnsiTheme="majorBidi" w:cstheme="majorBidi"/>
+          <w:sz w:val="28"/>
+          <w:szCs w:val="28"/>
+        </w:rPr>
+        <w:t>,</w:t>
+      </w:r>
+      <w:r>
+        <w:rPr>
+          <w:rFonts w:asciiTheme="majorBidi" w:hAnsiTheme="majorBidi" w:cstheme="majorBidi"/>
+          <w:sz w:val="28"/>
+          <w:szCs w:val="28"/>
+        </w:rPr>
+        <w:t xml:space="preserve"> </w:t>
       </w:r>
       <w:r>
         <w:rPr>
@@ -1539,6 +1790,8 @@
       <w:r>
         <w:rPr>
           <w:rFonts w:asciiTheme="majorBidi" w:hAnsiTheme="majorBidi" w:cstheme="majorBidi"/>
+          <w:b/>
+          <w:bCs/>
           <w:sz w:val="28"/>
           <w:szCs w:val="28"/>
         </w:rPr>
@@ -1576,6 +1829,8 @@
       <w:r>
         <w:rPr>
           <w:rFonts w:asciiTheme="majorBidi" w:hAnsiTheme="majorBidi" w:cstheme="majorBidi"/>
+          <w:b/>
+          <w:bCs/>
           <w:sz w:val="28"/>
           <w:szCs w:val="28"/>
         </w:rPr>
@@ -1594,6 +1849,8 @@
       <w:r>
         <w:rPr>
           <w:rFonts w:asciiTheme="majorBidi" w:hAnsiTheme="majorBidi" w:cstheme="majorBidi"/>
+          <w:b/>
+          <w:bCs/>
           <w:sz w:val="28"/>
           <w:szCs w:val="28"/>
         </w:rPr>
@@ -1614,7 +1871,15 @@
           <w:sz w:val="28"/>
           <w:szCs w:val="28"/>
         </w:rPr>
-        <w:t xml:space="preserve"> - </w:t>
+        <w:t>,</w:t>
+      </w:r>
+      <w:r>
+        <w:rPr>
+          <w:rFonts w:asciiTheme="majorBidi" w:hAnsiTheme="majorBidi" w:cstheme="majorBidi"/>
+          <w:sz w:val="28"/>
+          <w:szCs w:val="28"/>
+        </w:rPr>
+        <w:t xml:space="preserve"> </w:t>
       </w:r>
       <w:r>
         <w:rPr>
@@ -1630,7 +1895,15 @@
           <w:sz w:val="28"/>
           <w:szCs w:val="28"/>
         </w:rPr>
-        <w:t xml:space="preserve"> - </w:t>
+        <w:t>,</w:t>
+      </w:r>
+      <w:r>
+        <w:rPr>
+          <w:rFonts w:asciiTheme="majorBidi" w:hAnsiTheme="majorBidi" w:cstheme="majorBidi"/>
+          <w:sz w:val="28"/>
+          <w:szCs w:val="28"/>
+        </w:rPr>
+        <w:t xml:space="preserve"> </w:t>
       </w:r>
       <w:r>
         <w:rPr>
@@ -1644,6 +1917,8 @@
       <w:r>
         <w:rPr>
           <w:rFonts w:asciiTheme="majorBidi" w:hAnsiTheme="majorBidi" w:cstheme="majorBidi"/>
+          <w:b/>
+          <w:bCs/>
           <w:sz w:val="28"/>
           <w:szCs w:val="28"/>
         </w:rPr>
@@ -1662,6 +1937,8 @@
       <w:r>
         <w:rPr>
           <w:rFonts w:asciiTheme="majorBidi" w:hAnsiTheme="majorBidi" w:cstheme="majorBidi"/>
+          <w:b/>
+          <w:bCs/>
           <w:sz w:val="28"/>
           <w:szCs w:val="28"/>
         </w:rPr>
@@ -1671,15 +1948,27 @@
       <w:r>
         <w:rPr>
           <w:rFonts w:asciiTheme="majorBidi" w:hAnsiTheme="majorBidi" w:cstheme="majorBidi"/>
-          <w:sz w:val="28"/>
-          <w:szCs w:val="28"/>
-        </w:rPr>
-        <w:t xml:space="preserve">-scheduler, </w:t>
+          <w:b/>
+          <w:bCs/>
+          <w:sz w:val="28"/>
+          <w:szCs w:val="28"/>
+        </w:rPr>
+        <w:t>-scheduler</w:t>
+      </w:r>
+      <w:r>
+        <w:rPr>
+          <w:rFonts w:asciiTheme="majorBidi" w:hAnsiTheme="majorBidi" w:cstheme="majorBidi"/>
+          <w:sz w:val="28"/>
+          <w:szCs w:val="28"/>
+        </w:rPr>
+        <w:t xml:space="preserve">, </w:t>
       </w:r>
       <w:proofErr w:type="spellStart"/>
       <w:r>
         <w:rPr>
           <w:rFonts w:asciiTheme="majorBidi" w:hAnsiTheme="majorBidi" w:cstheme="majorBidi"/>
+          <w:b/>
+          <w:bCs/>
           <w:sz w:val="28"/>
           <w:szCs w:val="28"/>
         </w:rPr>
@@ -1689,15 +1978,27 @@
       <w:r>
         <w:rPr>
           <w:rFonts w:asciiTheme="majorBidi" w:hAnsiTheme="majorBidi" w:cstheme="majorBidi"/>
-          <w:sz w:val="28"/>
-          <w:szCs w:val="28"/>
-        </w:rPr>
-        <w:t xml:space="preserve">-controller with, and </w:t>
+          <w:b/>
+          <w:bCs/>
+          <w:sz w:val="28"/>
+          <w:szCs w:val="28"/>
+        </w:rPr>
+        <w:t>-controller</w:t>
+      </w:r>
+      <w:r>
+        <w:rPr>
+          <w:rFonts w:asciiTheme="majorBidi" w:hAnsiTheme="majorBidi" w:cstheme="majorBidi"/>
+          <w:sz w:val="28"/>
+          <w:szCs w:val="28"/>
+        </w:rPr>
+        <w:t xml:space="preserve"> and </w:t>
       </w:r>
       <w:proofErr w:type="spellStart"/>
       <w:r>
         <w:rPr>
           <w:rFonts w:asciiTheme="majorBidi" w:hAnsiTheme="majorBidi" w:cstheme="majorBidi"/>
+          <w:b/>
+          <w:bCs/>
           <w:sz w:val="28"/>
           <w:szCs w:val="28"/>
         </w:rPr>
@@ -1716,6 +2017,8 @@
       <w:r>
         <w:rPr>
           <w:rFonts w:asciiTheme="majorBidi" w:hAnsiTheme="majorBidi" w:cstheme="majorBidi"/>
+          <w:b/>
+          <w:bCs/>
           <w:sz w:val="28"/>
           <w:szCs w:val="28"/>
         </w:rPr>
@@ -1771,6 +2074,8 @@
       <w:r>
         <w:rPr>
           <w:rFonts w:asciiTheme="majorBidi" w:hAnsiTheme="majorBidi" w:cstheme="majorBidi"/>
+          <w:b/>
+          <w:bCs/>
           <w:sz w:val="28"/>
           <w:szCs w:val="28"/>
         </w:rPr>
@@ -1789,6 +2094,8 @@
       <w:r>
         <w:rPr>
           <w:rFonts w:asciiTheme="majorBidi" w:hAnsiTheme="majorBidi" w:cstheme="majorBidi"/>
+          <w:b/>
+          <w:bCs/>
           <w:sz w:val="28"/>
           <w:szCs w:val="28"/>
         </w:rPr>
@@ -1807,6 +2114,8 @@
       <w:r>
         <w:rPr>
           <w:rFonts w:asciiTheme="majorBidi" w:hAnsiTheme="majorBidi" w:cstheme="majorBidi"/>
+          <w:b/>
+          <w:bCs/>
           <w:sz w:val="28"/>
           <w:szCs w:val="28"/>
         </w:rPr>
@@ -1825,6 +2134,8 @@
       <w:r>
         <w:rPr>
           <w:rFonts w:asciiTheme="majorBidi" w:hAnsiTheme="majorBidi" w:cstheme="majorBidi"/>
+          <w:b/>
+          <w:bCs/>
           <w:sz w:val="28"/>
           <w:szCs w:val="28"/>
         </w:rPr>
@@ -1842,6 +2153,7 @@
     </w:p>
     <w:p>
       <w:pPr>
+        <w:spacing w:after="120"/>
         <w:jc w:val="both"/>
         <w:rPr>
           <w:rFonts w:asciiTheme="majorBidi" w:hAnsiTheme="majorBidi" w:cstheme="majorBidi"/>
@@ -1861,6 +2173,8 @@
       <w:r>
         <w:rPr>
           <w:rFonts w:asciiTheme="majorBidi" w:hAnsiTheme="majorBidi" w:cstheme="majorBidi"/>
+          <w:b/>
+          <w:bCs/>
           <w:sz w:val="28"/>
           <w:szCs w:val="28"/>
         </w:rPr>
@@ -1879,6 +2193,8 @@
       <w:r>
         <w:rPr>
           <w:rFonts w:asciiTheme="majorBidi" w:hAnsiTheme="majorBidi" w:cstheme="majorBidi"/>
+          <w:b/>
+          <w:bCs/>
           <w:sz w:val="28"/>
           <w:szCs w:val="28"/>
         </w:rPr>
@@ -1915,6 +2231,8 @@
       <w:r>
         <w:rPr>
           <w:rFonts w:asciiTheme="majorBidi" w:hAnsiTheme="majorBidi" w:cstheme="majorBidi"/>
+          <w:b/>
+          <w:bCs/>
           <w:sz w:val="28"/>
           <w:szCs w:val="28"/>
         </w:rPr>
@@ -2123,7 +2441,6 @@
           <w:sz w:val="28"/>
           <w:szCs w:val="28"/>
         </w:rPr>
-        <w:lastRenderedPageBreak/>
         <w:t>CPU and memory requirements</w:t>
       </w:r>
     </w:p>
@@ -2196,6 +2513,7 @@
           <w:sz w:val="28"/>
           <w:szCs w:val="28"/>
         </w:rPr>
+        <w:lastRenderedPageBreak/>
         <w:t>affinity and anti-affinity rules</w:t>
       </w:r>
     </w:p>
@@ -2266,7 +2584,7 @@
           <w:sz w:val="28"/>
           <w:szCs w:val="28"/>
         </w:rPr>
-        <w:t xml:space="preserve"> - </w:t>
+        <w:t xml:space="preserve"> </w:t>
       </w:r>
       <w:r>
         <w:rPr>
@@ -2300,7 +2618,15 @@
           <w:sz w:val="28"/>
           <w:szCs w:val="28"/>
         </w:rPr>
-        <w:t xml:space="preserve"> - </w:t>
+        <w:t>,</w:t>
+      </w:r>
+      <w:r>
+        <w:rPr>
+          <w:rFonts w:asciiTheme="majorBidi" w:hAnsiTheme="majorBidi" w:cstheme="majorBidi"/>
+          <w:sz w:val="28"/>
+          <w:szCs w:val="28"/>
+        </w:rPr>
+        <w:t xml:space="preserve"> </w:t>
       </w:r>
       <w:r>
         <w:rPr>
@@ -2314,6 +2640,8 @@
       <w:r>
         <w:rPr>
           <w:rFonts w:asciiTheme="majorBidi" w:hAnsiTheme="majorBidi" w:cstheme="majorBidi"/>
+          <w:b/>
+          <w:bCs/>
           <w:sz w:val="28"/>
           <w:szCs w:val="28"/>
         </w:rPr>
@@ -2332,6 +2660,8 @@
       <w:r>
         <w:rPr>
           <w:rFonts w:asciiTheme="majorBidi" w:hAnsiTheme="majorBidi" w:cstheme="majorBidi"/>
+          <w:b/>
+          <w:bCs/>
           <w:sz w:val="28"/>
           <w:szCs w:val="28"/>
         </w:rPr>
@@ -2350,6 +2680,8 @@
       <w:r>
         <w:rPr>
           <w:rFonts w:asciiTheme="majorBidi" w:hAnsiTheme="majorBidi" w:cstheme="majorBidi"/>
+          <w:b/>
+          <w:bCs/>
           <w:sz w:val="28"/>
           <w:szCs w:val="28"/>
         </w:rPr>
@@ -2359,10 +2691,20 @@
       <w:r>
         <w:rPr>
           <w:rFonts w:asciiTheme="majorBidi" w:hAnsiTheme="majorBidi" w:cstheme="majorBidi"/>
-          <w:sz w:val="28"/>
-          <w:szCs w:val="28"/>
-        </w:rPr>
-        <w:t>-scheduler becomes responsible for selecting a suitable node for that Pod.</w:t>
+          <w:b/>
+          <w:bCs/>
+          <w:sz w:val="28"/>
+          <w:szCs w:val="28"/>
+        </w:rPr>
+        <w:t>-scheduler</w:t>
+      </w:r>
+      <w:r>
+        <w:rPr>
+          <w:rFonts w:asciiTheme="majorBidi" w:hAnsiTheme="majorBidi" w:cstheme="majorBidi"/>
+          <w:sz w:val="28"/>
+          <w:szCs w:val="28"/>
+        </w:rPr>
+        <w:t xml:space="preserve"> becomes responsible for selecting a suitable node for that Pod.</w:t>
       </w:r>
     </w:p>
     <w:p>
@@ -2436,7 +2778,39 @@
           <w:sz w:val="28"/>
           <w:szCs w:val="28"/>
         </w:rPr>
-        <w:t>Scheduling decisions are made each time a new Pod needs placement. If a Pod is deleted and recreated—such as during scaling operations, rolling updates, or controller-driven replacement—the new Pod is again unscheduled and must be evaluated by the scheduler. In this process the scheduler recalculates the best node based on the current cluster conditions, which may lead to a different node being selected than the one used previously. This dynamic scheduling process helps Kubernetes distribute workloads efficiently across the cluster and adapt to changing resource availability.</w:t>
+        <w:t>Scheduling decisions are made each time a new Pod needs placement. If a Pod is deleted and recreated</w:t>
+      </w:r>
+      <w:r>
+        <w:rPr>
+          <w:rFonts w:asciiTheme="majorBidi" w:hAnsiTheme="majorBidi" w:cstheme="majorBidi"/>
+          <w:sz w:val="28"/>
+          <w:szCs w:val="28"/>
+        </w:rPr>
+        <w:t xml:space="preserve">, </w:t>
+      </w:r>
+      <w:r>
+        <w:rPr>
+          <w:rFonts w:asciiTheme="majorBidi" w:hAnsiTheme="majorBidi" w:cstheme="majorBidi"/>
+          <w:sz w:val="28"/>
+          <w:szCs w:val="28"/>
+        </w:rPr>
+        <w:t>such as during scaling operations, rolling updates, or controller-driven replacement</w:t>
+      </w:r>
+      <w:r>
+        <w:rPr>
+          <w:rFonts w:asciiTheme="majorBidi" w:hAnsiTheme="majorBidi" w:cstheme="majorBidi"/>
+          <w:sz w:val="28"/>
+          <w:szCs w:val="28"/>
+        </w:rPr>
+        <w:t xml:space="preserve">, </w:t>
+      </w:r>
+      <w:r>
+        <w:rPr>
+          <w:rFonts w:asciiTheme="majorBidi" w:hAnsiTheme="majorBidi" w:cstheme="majorBidi"/>
+          <w:sz w:val="28"/>
+          <w:szCs w:val="28"/>
+        </w:rPr>
+        <w:t>the new Pod is again unscheduled and must be evaluated by the scheduler. In this process the scheduler recalculates the best node based on the current cluster conditions, which may lead to a different node being selected than the one used previously. This dynamic scheduling process helps Kubernetes distribute workloads efficiently across the cluster and adapt to changing resource availability.</w:t>
       </w:r>
     </w:p>
     <w:p>
@@ -2560,80 +2934,80 @@
           <w:sz w:val="28"/>
           <w:szCs w:val="28"/>
         </w:rPr>
+        <w:t>ReplicaSet</w:t>
+      </w:r>
+      <w:proofErr w:type="spellEnd"/>
+      <w:r>
+        <w:rPr>
+          <w:rFonts w:asciiTheme="majorBidi" w:hAnsiTheme="majorBidi" w:cstheme="majorBidi"/>
+          <w:b/>
+          <w:bCs/>
+          <w:sz w:val="28"/>
+          <w:szCs w:val="28"/>
+        </w:rPr>
+        <w:t xml:space="preserve"> Controller</w:t>
+      </w:r>
+      <w:r>
+        <w:rPr>
+          <w:rFonts w:asciiTheme="majorBidi" w:hAnsiTheme="majorBidi" w:cstheme="majorBidi"/>
+          <w:b/>
+          <w:bCs/>
+          <w:sz w:val="28"/>
+          <w:szCs w:val="28"/>
+        </w:rPr>
+        <w:t xml:space="preserve"> </w:t>
+      </w:r>
+      <w:r>
+        <w:rPr>
+          <w:rFonts w:asciiTheme="majorBidi" w:hAnsiTheme="majorBidi" w:cstheme="majorBidi"/>
+          <w:sz w:val="28"/>
+          <w:szCs w:val="28"/>
+        </w:rPr>
+        <w:t xml:space="preserve">→ </w:t>
+      </w:r>
+      <w:r>
+        <w:rPr>
+          <w:rFonts w:asciiTheme="majorBidi" w:hAnsiTheme="majorBidi" w:cstheme="majorBidi"/>
+          <w:sz w:val="28"/>
+          <w:szCs w:val="28"/>
+        </w:rPr>
+        <w:t>Ensures the correct number of pods are running.</w:t>
+      </w:r>
+    </w:p>
+    <w:p>
+      <w:pPr>
+        <w:jc w:val="both"/>
+        <w:rPr>
+          <w:rFonts w:asciiTheme="majorBidi" w:hAnsiTheme="majorBidi" w:cstheme="majorBidi"/>
+          <w:sz w:val="28"/>
+          <w:szCs w:val="28"/>
+        </w:rPr>
+      </w:pPr>
+      <w:r>
+        <w:rPr>
+          <w:rFonts w:asciiTheme="majorBidi" w:hAnsiTheme="majorBidi" w:cstheme="majorBidi"/>
+          <w:sz w:val="28"/>
+          <w:szCs w:val="28"/>
+        </w:rPr>
+        <w:t xml:space="preserve">Scenario: </w:t>
+      </w:r>
+    </w:p>
+    <w:p>
+      <w:pPr>
+        <w:jc w:val="both"/>
+        <w:rPr>
+          <w:rFonts w:asciiTheme="majorBidi" w:hAnsiTheme="majorBidi" w:cstheme="majorBidi"/>
+          <w:sz w:val="28"/>
+          <w:szCs w:val="28"/>
+        </w:rPr>
+      </w:pPr>
+      <w:r>
+        <w:rPr>
+          <w:rFonts w:asciiTheme="majorBidi" w:hAnsiTheme="majorBidi" w:cstheme="majorBidi"/>
+          <w:sz w:val="28"/>
+          <w:szCs w:val="28"/>
+        </w:rPr>
         <w:lastRenderedPageBreak/>
-        <w:t>ReplicaSet</w:t>
-      </w:r>
-      <w:proofErr w:type="spellEnd"/>
-      <w:r>
-        <w:rPr>
-          <w:rFonts w:asciiTheme="majorBidi" w:hAnsiTheme="majorBidi" w:cstheme="majorBidi"/>
-          <w:b/>
-          <w:bCs/>
-          <w:sz w:val="28"/>
-          <w:szCs w:val="28"/>
-        </w:rPr>
-        <w:t xml:space="preserve"> Controller</w:t>
-      </w:r>
-      <w:r>
-        <w:rPr>
-          <w:rFonts w:asciiTheme="majorBidi" w:hAnsiTheme="majorBidi" w:cstheme="majorBidi"/>
-          <w:b/>
-          <w:bCs/>
-          <w:sz w:val="28"/>
-          <w:szCs w:val="28"/>
-        </w:rPr>
-        <w:t xml:space="preserve"> </w:t>
-      </w:r>
-      <w:r>
-        <w:rPr>
-          <w:rFonts w:asciiTheme="majorBidi" w:hAnsiTheme="majorBidi" w:cstheme="majorBidi"/>
-          <w:sz w:val="28"/>
-          <w:szCs w:val="28"/>
-        </w:rPr>
-        <w:t xml:space="preserve">→ </w:t>
-      </w:r>
-      <w:r>
-        <w:rPr>
-          <w:rFonts w:asciiTheme="majorBidi" w:hAnsiTheme="majorBidi" w:cstheme="majorBidi"/>
-          <w:sz w:val="28"/>
-          <w:szCs w:val="28"/>
-        </w:rPr>
-        <w:t>Ensures the correct number of pods are running.</w:t>
-      </w:r>
-    </w:p>
-    <w:p>
-      <w:pPr>
-        <w:jc w:val="both"/>
-        <w:rPr>
-          <w:rFonts w:asciiTheme="majorBidi" w:hAnsiTheme="majorBidi" w:cstheme="majorBidi"/>
-          <w:sz w:val="28"/>
-          <w:szCs w:val="28"/>
-        </w:rPr>
-      </w:pPr>
-      <w:r>
-        <w:rPr>
-          <w:rFonts w:asciiTheme="majorBidi" w:hAnsiTheme="majorBidi" w:cstheme="majorBidi"/>
-          <w:sz w:val="28"/>
-          <w:szCs w:val="28"/>
-        </w:rPr>
-        <w:t xml:space="preserve">Scenario: </w:t>
-      </w:r>
-    </w:p>
-    <w:p>
-      <w:pPr>
-        <w:jc w:val="both"/>
-        <w:rPr>
-          <w:rFonts w:asciiTheme="majorBidi" w:hAnsiTheme="majorBidi" w:cstheme="majorBidi"/>
-          <w:sz w:val="28"/>
-          <w:szCs w:val="28"/>
-        </w:rPr>
-      </w:pPr>
-      <w:r>
-        <w:rPr>
-          <w:rFonts w:asciiTheme="majorBidi" w:hAnsiTheme="majorBidi" w:cstheme="majorBidi"/>
-          <w:sz w:val="28"/>
-          <w:szCs w:val="28"/>
-        </w:rPr>
         <w:t>Desired state</w:t>
       </w:r>
       <w:r>
@@ -3027,8 +3401,18 @@
           <w:sz w:val="28"/>
           <w:szCs w:val="28"/>
         </w:rPr>
-        <w:t xml:space="preserve">Many well-known Kubernetes features are implemented through these controllers. Self-healing occurs when controllers detect that a Pod or node has failed and create replacements to restore the desired state. Scaling operations are handled by controllers that adjust the number of running Pods to match the requested replica count. Rolling updates and rollbacks are coordinated by controllers that gradually replace old Pods with new ones while maintaining service availability. </w:t>
-      </w:r>
+        <w:t>Many well-known Kubernetes features are implemented through these controllers. Self-healing occurs when controllers detect that a Pod or node has failed and create replacements to restore the desired state. Scaling operations are handled by controllers that adjust the number of running Pods to match the requested replica count. Rolling updates and rollbacks are coordinated by controllers that gradually replace old Pods with new ones while maintaining service availability. Storage orchestration and other cluster behaviors are also managed through specialized controllers that watch resource changes and trigger the appropriate actions.</w:t>
+      </w:r>
+    </w:p>
+    <w:p>
+      <w:pPr>
+        <w:jc w:val="both"/>
+        <w:rPr>
+          <w:rFonts w:asciiTheme="majorBidi" w:hAnsiTheme="majorBidi" w:cstheme="majorBidi"/>
+          <w:sz w:val="28"/>
+          <w:szCs w:val="28"/>
+        </w:rPr>
+      </w:pPr>
       <w:r>
         <w:rPr>
           <w:rFonts w:asciiTheme="majorBidi" w:hAnsiTheme="majorBidi" w:cstheme="majorBidi"/>
@@ -3036,24 +3420,6 @@
           <w:szCs w:val="28"/>
         </w:rPr>
         <w:lastRenderedPageBreak/>
-        <w:t>Storage orchestration and other cluster behaviors are also managed through specialized controllers that watch resource changes and trigger the appropriate actions.</w:t>
-      </w:r>
-    </w:p>
-    <w:p>
-      <w:pPr>
-        <w:jc w:val="both"/>
-        <w:rPr>
-          <w:rFonts w:asciiTheme="majorBidi" w:hAnsiTheme="majorBidi" w:cstheme="majorBidi"/>
-          <w:sz w:val="28"/>
-          <w:szCs w:val="28"/>
-        </w:rPr>
-      </w:pPr>
-      <w:r>
-        <w:rPr>
-          <w:rFonts w:asciiTheme="majorBidi" w:hAnsiTheme="majorBidi" w:cstheme="majorBidi"/>
-          <w:sz w:val="28"/>
-          <w:szCs w:val="28"/>
-        </w:rPr>
         <w:t xml:space="preserve">For this reason, the </w:t>
       </w:r>
       <w:proofErr w:type="spellStart"/>
@@ -3629,16 +3995,7 @@
           <w:sz w:val="28"/>
           <w:szCs w:val="28"/>
         </w:rPr>
-        <w:t xml:space="preserve">Since the control plane components </w:t>
-      </w:r>
-      <w:r>
-        <w:rPr>
-          <w:rFonts w:asciiTheme="majorBidi" w:hAnsiTheme="majorBidi" w:cstheme="majorBidi"/>
-          <w:sz w:val="28"/>
-          <w:szCs w:val="28"/>
-        </w:rPr>
-        <w:lastRenderedPageBreak/>
-        <w:t xml:space="preserve">run as Pods (static Pods) on the control plane node, something must run those Pods </w:t>
+        <w:t xml:space="preserve">Since the control plane components run as Pods (static Pods) on the control plane node, something must run those Pods </w:t>
       </w:r>
       <w:r>
         <w:rPr>
@@ -3714,6 +4071,7 @@
           <w:sz w:val="28"/>
           <w:szCs w:val="28"/>
         </w:rPr>
+        <w:lastRenderedPageBreak/>
         <w:t>communicates with the API server</w:t>
       </w:r>
     </w:p>
@@ -4394,7 +4752,89 @@
           <w:sz w:val="28"/>
           <w:szCs w:val="28"/>
         </w:rPr>
-        <w:t xml:space="preserve"> or CRI‑O). It ensures the required container images are pulled, the containers are created and started, and any specified configurations are applied. This includes setting up volumes, configuring environment variables, applying resource limits, and ensuring network settings and </w:t>
+        <w:t xml:space="preserve"> or CRI‑O). It ensures the required container images are pulled, the containers are created and started, and any specified configurations are applied. This includes setting up volumes, configuring environment variables, applying resource limits, and ensuring network settings and exposed ports are properly configured. </w:t>
+      </w:r>
+      <w:proofErr w:type="spellStart"/>
+      <w:r>
+        <w:rPr>
+          <w:rFonts w:asciiTheme="majorBidi" w:hAnsiTheme="majorBidi" w:cstheme="majorBidi"/>
+          <w:sz w:val="28"/>
+          <w:szCs w:val="28"/>
+        </w:rPr>
+        <w:t>Kubelet</w:t>
+      </w:r>
+      <w:proofErr w:type="spellEnd"/>
+      <w:r>
+        <w:rPr>
+          <w:rFonts w:asciiTheme="majorBidi" w:hAnsiTheme="majorBidi" w:cstheme="majorBidi"/>
+          <w:sz w:val="28"/>
+          <w:szCs w:val="28"/>
+        </w:rPr>
+        <w:t xml:space="preserve"> also reports the status of the node and its running Pods back to the API server.</w:t>
+      </w:r>
+    </w:p>
+    <w:p>
+      <w:pPr>
+        <w:spacing w:after="60"/>
+        <w:rPr>
+          <w:rFonts w:asciiTheme="majorBidi" w:hAnsiTheme="majorBidi" w:cstheme="majorBidi"/>
+          <w:sz w:val="28"/>
+          <w:szCs w:val="28"/>
+        </w:rPr>
+      </w:pPr>
+      <w:proofErr w:type="spellStart"/>
+      <w:r>
+        <w:rPr>
+          <w:rFonts w:asciiTheme="majorBidi" w:hAnsiTheme="majorBidi" w:cstheme="majorBidi"/>
+          <w:sz w:val="28"/>
+          <w:szCs w:val="28"/>
+        </w:rPr>
+        <w:t>Kubelet</w:t>
+      </w:r>
+      <w:proofErr w:type="spellEnd"/>
+      <w:r>
+        <w:rPr>
+          <w:rFonts w:asciiTheme="majorBidi" w:hAnsiTheme="majorBidi" w:cstheme="majorBidi"/>
+          <w:sz w:val="28"/>
+          <w:szCs w:val="28"/>
+        </w:rPr>
+        <w:t xml:space="preserve"> is also responsible for maintaining the health of Pods on its node. It continuously monitors container status and enforces restart policies defined in the Pod specification. If a container inside a </w:t>
+      </w:r>
+      <w:proofErr w:type="gramStart"/>
+      <w:r>
+        <w:rPr>
+          <w:rFonts w:asciiTheme="majorBidi" w:hAnsiTheme="majorBidi" w:cstheme="majorBidi"/>
+          <w:sz w:val="28"/>
+          <w:szCs w:val="28"/>
+        </w:rPr>
+        <w:t>Pod crashes</w:t>
+      </w:r>
+      <w:proofErr w:type="gramEnd"/>
+      <w:r>
+        <w:rPr>
+          <w:rFonts w:asciiTheme="majorBidi" w:hAnsiTheme="majorBidi" w:cstheme="majorBidi"/>
+          <w:sz w:val="28"/>
+          <w:szCs w:val="28"/>
+        </w:rPr>
+        <w:t xml:space="preserve"> or stops unexpectedly, </w:t>
+      </w:r>
+      <w:proofErr w:type="spellStart"/>
+      <w:r>
+        <w:rPr>
+          <w:rFonts w:asciiTheme="majorBidi" w:hAnsiTheme="majorBidi" w:cstheme="majorBidi"/>
+          <w:sz w:val="28"/>
+          <w:szCs w:val="28"/>
+        </w:rPr>
+        <w:t>kubelet</w:t>
+      </w:r>
+      <w:proofErr w:type="spellEnd"/>
+      <w:r>
+        <w:rPr>
+          <w:rFonts w:asciiTheme="majorBidi" w:hAnsiTheme="majorBidi" w:cstheme="majorBidi"/>
+          <w:sz w:val="28"/>
+          <w:szCs w:val="28"/>
+        </w:rPr>
+        <w:t xml:space="preserve"> attempts to restart it according to </w:t>
       </w:r>
       <w:r>
         <w:rPr>
@@ -4403,89 +4843,7 @@
           <w:szCs w:val="28"/>
         </w:rPr>
         <w:lastRenderedPageBreak/>
-        <w:t xml:space="preserve">exposed ports are properly configured. </w:t>
-      </w:r>
-      <w:proofErr w:type="spellStart"/>
-      <w:r>
-        <w:rPr>
-          <w:rFonts w:asciiTheme="majorBidi" w:hAnsiTheme="majorBidi" w:cstheme="majorBidi"/>
-          <w:sz w:val="28"/>
-          <w:szCs w:val="28"/>
-        </w:rPr>
-        <w:t>Kubelet</w:t>
-      </w:r>
-      <w:proofErr w:type="spellEnd"/>
-      <w:r>
-        <w:rPr>
-          <w:rFonts w:asciiTheme="majorBidi" w:hAnsiTheme="majorBidi" w:cstheme="majorBidi"/>
-          <w:sz w:val="28"/>
-          <w:szCs w:val="28"/>
-        </w:rPr>
-        <w:t xml:space="preserve"> also reports the status of the node and its running Pods back to the API server.</w:t>
-      </w:r>
-    </w:p>
-    <w:p>
-      <w:pPr>
-        <w:spacing w:after="60"/>
-        <w:rPr>
-          <w:rFonts w:asciiTheme="majorBidi" w:hAnsiTheme="majorBidi" w:cstheme="majorBidi"/>
-          <w:sz w:val="28"/>
-          <w:szCs w:val="28"/>
-        </w:rPr>
-      </w:pPr>
-      <w:proofErr w:type="spellStart"/>
-      <w:r>
-        <w:rPr>
-          <w:rFonts w:asciiTheme="majorBidi" w:hAnsiTheme="majorBidi" w:cstheme="majorBidi"/>
-          <w:sz w:val="28"/>
-          <w:szCs w:val="28"/>
-        </w:rPr>
-        <w:t>Kubelet</w:t>
-      </w:r>
-      <w:proofErr w:type="spellEnd"/>
-      <w:r>
-        <w:rPr>
-          <w:rFonts w:asciiTheme="majorBidi" w:hAnsiTheme="majorBidi" w:cstheme="majorBidi"/>
-          <w:sz w:val="28"/>
-          <w:szCs w:val="28"/>
-        </w:rPr>
-        <w:t xml:space="preserve"> is also responsible for maintaining the health of Pods on its node. It continuously monitors container status and enforces restart policies defined in the Pod specification. If a container inside a </w:t>
-      </w:r>
-      <w:proofErr w:type="gramStart"/>
-      <w:r>
-        <w:rPr>
-          <w:rFonts w:asciiTheme="majorBidi" w:hAnsiTheme="majorBidi" w:cstheme="majorBidi"/>
-          <w:sz w:val="28"/>
-          <w:szCs w:val="28"/>
-        </w:rPr>
-        <w:t>Pod crashes</w:t>
-      </w:r>
-      <w:proofErr w:type="gramEnd"/>
-      <w:r>
-        <w:rPr>
-          <w:rFonts w:asciiTheme="majorBidi" w:hAnsiTheme="majorBidi" w:cstheme="majorBidi"/>
-          <w:sz w:val="28"/>
-          <w:szCs w:val="28"/>
-        </w:rPr>
-        <w:t xml:space="preserve"> or stops unexpectedly, </w:t>
-      </w:r>
-      <w:proofErr w:type="spellStart"/>
-      <w:r>
-        <w:rPr>
-          <w:rFonts w:asciiTheme="majorBidi" w:hAnsiTheme="majorBidi" w:cstheme="majorBidi"/>
-          <w:sz w:val="28"/>
-          <w:szCs w:val="28"/>
-        </w:rPr>
-        <w:t>kubelet</w:t>
-      </w:r>
-      <w:proofErr w:type="spellEnd"/>
-      <w:r>
-        <w:rPr>
-          <w:rFonts w:asciiTheme="majorBidi" w:hAnsiTheme="majorBidi" w:cstheme="majorBidi"/>
-          <w:sz w:val="28"/>
-          <w:szCs w:val="28"/>
-        </w:rPr>
-        <w:t xml:space="preserve"> attempts to restart it according to the configured policy. This behavior contributes to Kubernetes’ self‑healing capabilities at the node level.</w:t>
+        <w:t>the configured policy. This behavior contributes to Kubernetes’ self‑healing capabilities at the node level.</w:t>
       </w:r>
     </w:p>
     <w:p>
@@ -5142,16 +5500,7 @@
           <w:sz w:val="28"/>
           <w:szCs w:val="28"/>
         </w:rPr>
-        <w:t xml:space="preserve">Since Pods may run on any node, each node </w:t>
-      </w:r>
-      <w:r>
-        <w:rPr>
-          <w:rFonts w:asciiTheme="majorBidi" w:hAnsiTheme="majorBidi" w:cstheme="majorBidi"/>
-          <w:sz w:val="28"/>
-          <w:szCs w:val="28"/>
-        </w:rPr>
-        <w:lastRenderedPageBreak/>
-        <w:t xml:space="preserve">needs </w:t>
+        <w:t xml:space="preserve">Since Pods may run on any node, each node needs </w:t>
       </w:r>
       <w:proofErr w:type="spellStart"/>
       <w:r>
@@ -5303,6 +5652,7 @@
           <w:sz w:val="32"/>
           <w:szCs w:val="32"/>
         </w:rPr>
+        <w:lastRenderedPageBreak/>
         <w:t>What the official architecture diagram implies</w:t>
       </w:r>
       <w:r>
@@ -6673,7 +7023,6 @@
           <w:sz w:val="28"/>
           <w:szCs w:val="28"/>
         </w:rPr>
-        <w:lastRenderedPageBreak/>
         <w:t>Controllers monitor resources.</w:t>
       </w:r>
     </w:p>
@@ -6776,6 +7125,7 @@
           <w:sz w:val="28"/>
           <w:szCs w:val="28"/>
         </w:rPr>
+        <w:lastRenderedPageBreak/>
         <w:t>Control Plane</w:t>
       </w:r>
     </w:p>
@@ -7774,7 +8124,6 @@
           <w:sz w:val="28"/>
           <w:szCs w:val="28"/>
         </w:rPr>
-        <w:lastRenderedPageBreak/>
         <w:t>Because they run as Pods, you can even see them using:</w:t>
       </w:r>
     </w:p>
@@ -7883,6 +8232,7 @@
           <w:sz w:val="28"/>
           <w:szCs w:val="28"/>
         </w:rPr>
+        <w:lastRenderedPageBreak/>
         <w:t>Static Pods are used for control plane components because the cluster must be able to start even before the API server is fully available.</w:t>
       </w:r>
       <w:r>
@@ -8609,8 +8959,55 @@
           <w:sz w:val="28"/>
           <w:szCs w:val="28"/>
         </w:rPr>
-        <w:t xml:space="preserve">. </w:t>
-      </w:r>
+        <w:t xml:space="preserve">. Instead of directly interacting with cluster components, </w:t>
+      </w:r>
+      <w:proofErr w:type="spellStart"/>
+      <w:r>
+        <w:rPr>
+          <w:rFonts w:asciiTheme="majorBidi" w:hAnsiTheme="majorBidi" w:cstheme="majorBidi"/>
+          <w:sz w:val="28"/>
+          <w:szCs w:val="28"/>
+        </w:rPr>
+        <w:t>kubectl</w:t>
+      </w:r>
+      <w:proofErr w:type="spellEnd"/>
+      <w:r>
+        <w:rPr>
+          <w:rFonts w:asciiTheme="majorBidi" w:hAnsiTheme="majorBidi" w:cstheme="majorBidi"/>
+          <w:sz w:val="28"/>
+          <w:szCs w:val="28"/>
+        </w:rPr>
+        <w:t xml:space="preserve"> sends REST API requests to the </w:t>
+      </w:r>
+      <w:proofErr w:type="spellStart"/>
+      <w:r>
+        <w:rPr>
+          <w:rFonts w:asciiTheme="majorBidi" w:hAnsiTheme="majorBidi" w:cstheme="majorBidi"/>
+          <w:sz w:val="28"/>
+          <w:szCs w:val="28"/>
+        </w:rPr>
+        <w:t>kube-apiserver</w:t>
+      </w:r>
+      <w:proofErr w:type="spellEnd"/>
+      <w:r>
+        <w:rPr>
+          <w:rFonts w:asciiTheme="majorBidi" w:hAnsiTheme="majorBidi" w:cstheme="majorBidi"/>
+          <w:sz w:val="28"/>
+          <w:szCs w:val="28"/>
+        </w:rPr>
+        <w:t>, which processes the request and coordinates the appropriate actions within the cluster.</w:t>
+      </w:r>
+    </w:p>
+    <w:p>
+      <w:pPr>
+        <w:spacing w:after="60"/>
+        <w:jc w:val="both"/>
+        <w:rPr>
+          <w:rFonts w:asciiTheme="majorBidi" w:hAnsiTheme="majorBidi" w:cstheme="majorBidi"/>
+          <w:sz w:val="28"/>
+          <w:szCs w:val="28"/>
+        </w:rPr>
+      </w:pPr>
       <w:r>
         <w:rPr>
           <w:rFonts w:asciiTheme="majorBidi" w:hAnsiTheme="majorBidi" w:cstheme="majorBidi"/>
@@ -8618,61 +9015,6 @@
           <w:szCs w:val="28"/>
         </w:rPr>
         <w:lastRenderedPageBreak/>
-        <w:t xml:space="preserve">Instead of directly interacting with cluster components, </w:t>
-      </w:r>
-      <w:proofErr w:type="spellStart"/>
-      <w:r>
-        <w:rPr>
-          <w:rFonts w:asciiTheme="majorBidi" w:hAnsiTheme="majorBidi" w:cstheme="majorBidi"/>
-          <w:sz w:val="28"/>
-          <w:szCs w:val="28"/>
-        </w:rPr>
-        <w:t>kubectl</w:t>
-      </w:r>
-      <w:proofErr w:type="spellEnd"/>
-      <w:r>
-        <w:rPr>
-          <w:rFonts w:asciiTheme="majorBidi" w:hAnsiTheme="majorBidi" w:cstheme="majorBidi"/>
-          <w:sz w:val="28"/>
-          <w:szCs w:val="28"/>
-        </w:rPr>
-        <w:t xml:space="preserve"> sends REST API requests to the </w:t>
-      </w:r>
-      <w:proofErr w:type="spellStart"/>
-      <w:r>
-        <w:rPr>
-          <w:rFonts w:asciiTheme="majorBidi" w:hAnsiTheme="majorBidi" w:cstheme="majorBidi"/>
-          <w:sz w:val="28"/>
-          <w:szCs w:val="28"/>
-        </w:rPr>
-        <w:t>kube-apiserver</w:t>
-      </w:r>
-      <w:proofErr w:type="spellEnd"/>
-      <w:r>
-        <w:rPr>
-          <w:rFonts w:asciiTheme="majorBidi" w:hAnsiTheme="majorBidi" w:cstheme="majorBidi"/>
-          <w:sz w:val="28"/>
-          <w:szCs w:val="28"/>
-        </w:rPr>
-        <w:t>, which processes the request and coordinates the appropriate actions within the cluster.</w:t>
-      </w:r>
-    </w:p>
-    <w:p>
-      <w:pPr>
-        <w:spacing w:after="60"/>
-        <w:jc w:val="both"/>
-        <w:rPr>
-          <w:rFonts w:asciiTheme="majorBidi" w:hAnsiTheme="majorBidi" w:cstheme="majorBidi"/>
-          <w:sz w:val="28"/>
-          <w:szCs w:val="28"/>
-        </w:rPr>
-      </w:pPr>
-      <w:r>
-        <w:rPr>
-          <w:rFonts w:asciiTheme="majorBidi" w:hAnsiTheme="majorBidi" w:cstheme="majorBidi"/>
-          <w:sz w:val="28"/>
-          <w:szCs w:val="28"/>
-        </w:rPr>
         <w:t xml:space="preserve">When a user runs a command such as </w:t>
       </w:r>
       <w:proofErr w:type="spellStart"/>
@@ -9363,7 +9705,6 @@
                                 <w:szCs w:val="28"/>
                               </w:rPr>
                             </w:pPr>
-                            <w:proofErr w:type="spellStart"/>
                             <w:r>
                               <w:rPr>
                                 <w:rFonts w:asciiTheme="majorBidi" w:hAnsiTheme="majorBidi" w:cstheme="majorBidi"/>
@@ -9374,20 +9715,7 @@
                                 <w:sz w:val="28"/>
                                 <w:szCs w:val="28"/>
                               </w:rPr>
-                              <w:t>kubectl</w:t>
-                            </w:r>
-                            <w:proofErr w:type="spellEnd"/>
-                            <w:r>
-                              <w:rPr>
-                                <w:rFonts w:asciiTheme="majorBidi" w:hAnsiTheme="majorBidi" w:cstheme="majorBidi"/>
-                                <w:b/>
-                                <w:bCs/>
-                                <w:i/>
-                                <w:iCs/>
-                                <w:sz w:val="28"/>
-                                <w:szCs w:val="28"/>
-                              </w:rPr>
-                              <w:t xml:space="preserve"> run nginx --image=nginx</w:t>
+                              <w:t>kubectl run nginx --image=nginx</w:t>
                             </w:r>
                             <w:r>
                               <w:rPr>
@@ -9762,7 +10090,6 @@
                           <w:szCs w:val="28"/>
                         </w:rPr>
                       </w:pPr>
-                      <w:proofErr w:type="spellStart"/>
                       <w:r>
                         <w:rPr>
                           <w:rFonts w:asciiTheme="majorBidi" w:hAnsiTheme="majorBidi" w:cstheme="majorBidi"/>
@@ -9773,20 +10100,7 @@
                           <w:sz w:val="28"/>
                           <w:szCs w:val="28"/>
                         </w:rPr>
-                        <w:t>kubectl</w:t>
-                      </w:r>
-                      <w:proofErr w:type="spellEnd"/>
-                      <w:r>
-                        <w:rPr>
-                          <w:rFonts w:asciiTheme="majorBidi" w:hAnsiTheme="majorBidi" w:cstheme="majorBidi"/>
-                          <w:b/>
-                          <w:bCs/>
-                          <w:i/>
-                          <w:iCs/>
-                          <w:sz w:val="28"/>
-                          <w:szCs w:val="28"/>
-                        </w:rPr>
-                        <w:t xml:space="preserve"> run nginx --image=nginx</w:t>
+                        <w:t>kubectl run nginx --image=nginx</w:t>
                       </w:r>
                       <w:r>
                         <w:rPr>
@@ -10155,7 +10469,6 @@
           <w:sz w:val="28"/>
           <w:szCs w:val="28"/>
         </w:rPr>
-        <w:lastRenderedPageBreak/>
         <mc:AlternateContent>
           <mc:Choice Requires="wps">
             <w:drawing>
@@ -10230,7 +10543,6 @@
                                 <w:szCs w:val="28"/>
                               </w:rPr>
                             </w:pPr>
-                            <w:proofErr w:type="spellStart"/>
                             <w:r>
                               <w:rPr>
                                 <w:rFonts w:asciiTheme="majorBidi" w:hAnsiTheme="majorBidi" w:cstheme="majorBidi"/>
@@ -10241,20 +10553,7 @@
                                 <w:sz w:val="28"/>
                                 <w:szCs w:val="28"/>
                               </w:rPr>
-                              <w:t>kubectl</w:t>
-                            </w:r>
-                            <w:proofErr w:type="spellEnd"/>
-                            <w:r>
-                              <w:rPr>
-                                <w:rFonts w:asciiTheme="majorBidi" w:hAnsiTheme="majorBidi" w:cstheme="majorBidi"/>
-                                <w:b/>
-                                <w:bCs/>
-                                <w:i/>
-                                <w:iCs/>
-                                <w:sz w:val="28"/>
-                                <w:szCs w:val="28"/>
-                              </w:rPr>
-                              <w:t xml:space="preserve"> scale deployment nginx --replicas=3</w:t>
+                              <w:t>kubectl scale deployment nginx --replicas=3</w:t>
                             </w:r>
                             <w:r>
                               <w:rPr>
@@ -10540,7 +10839,6 @@
                               </w:rPr>
                               <w:t xml:space="preserve">→ </w:t>
                             </w:r>
-                            <w:proofErr w:type="spellStart"/>
                             <w:r>
                               <w:rPr>
                                 <w:rFonts w:asciiTheme="majorBidi" w:hAnsiTheme="majorBidi" w:cstheme="majorBidi"/>
@@ -10551,37 +10849,8 @@
                                 <w:sz w:val="28"/>
                                 <w:szCs w:val="28"/>
                               </w:rPr>
-                              <w:t>kubectl</w:t>
+                              <w:t>kubectl apply -f deployment.yaml</w:t>
                             </w:r>
-                            <w:proofErr w:type="spellEnd"/>
-                            <w:r>
-                              <w:rPr>
-                                <w:rFonts w:asciiTheme="majorBidi" w:hAnsiTheme="majorBidi" w:cstheme="majorBidi"/>
-                                <w:b/>
-                                <w:bCs/>
-                                <w:i/>
-                                <w:iCs/>
-                                <w:sz w:val="28"/>
-                                <w:szCs w:val="28"/>
-                              </w:rPr>
-                              <w:t xml:space="preserve"> apply -f </w:t>
-                            </w:r>
-                            <w:proofErr w:type="spellStart"/>
-                            <w:proofErr w:type="gramStart"/>
-                            <w:r>
-                              <w:rPr>
-                                <w:rFonts w:asciiTheme="majorBidi" w:hAnsiTheme="majorBidi" w:cstheme="majorBidi"/>
-                                <w:b/>
-                                <w:bCs/>
-                                <w:i/>
-                                <w:iCs/>
-                                <w:sz w:val="28"/>
-                                <w:szCs w:val="28"/>
-                              </w:rPr>
-                              <w:t>deployment.yaml</w:t>
-                            </w:r>
-                            <w:proofErr w:type="spellEnd"/>
-                            <w:proofErr w:type="gramEnd"/>
                           </w:p>
                           <w:p>
                             <w:pPr>
@@ -10676,23 +10945,13 @@
                                 <w:szCs w:val="28"/>
                               </w:rPr>
                             </w:pPr>
-                            <w:proofErr w:type="gramStart"/>
                             <w:r>
                               <w:rPr>
                                 <w:rFonts w:asciiTheme="majorBidi" w:hAnsiTheme="majorBidi" w:cstheme="majorBidi"/>
                                 <w:sz w:val="28"/>
                                 <w:szCs w:val="28"/>
                               </w:rPr>
-                              <w:t>So</w:t>
-                            </w:r>
-                            <w:proofErr w:type="gramEnd"/>
-                            <w:r>
-                              <w:rPr>
-                                <w:rFonts w:asciiTheme="majorBidi" w:hAnsiTheme="majorBidi" w:cstheme="majorBidi"/>
-                                <w:sz w:val="28"/>
-                                <w:szCs w:val="28"/>
-                              </w:rPr>
-                              <w:t xml:space="preserve"> declarative = “This is the state I want.”</w:t>
+                              <w:t>So declarative = “This is the state I want.”</w:t>
                             </w:r>
                           </w:p>
                           <w:p>
@@ -10820,7 +11079,6 @@
                               </w:rPr>
                               <w:t xml:space="preserve">Example: </w:t>
                             </w:r>
-                            <w:proofErr w:type="spellStart"/>
                             <w:r>
                               <w:rPr>
                                 <w:rFonts w:asciiTheme="majorBidi" w:hAnsiTheme="majorBidi" w:cstheme="majorBidi"/>
@@ -10831,46 +11089,7 @@
                                 <w:sz w:val="28"/>
                                 <w:szCs w:val="28"/>
                               </w:rPr>
-                              <w:t>kubectl</w:t>
-                            </w:r>
-                            <w:proofErr w:type="spellEnd"/>
-                            <w:r>
-                              <w:rPr>
-                                <w:rFonts w:asciiTheme="majorBidi" w:hAnsiTheme="majorBidi" w:cstheme="majorBidi"/>
-                                <w:b/>
-                                <w:bCs/>
-                                <w:i/>
-                                <w:iCs/>
-                                <w:sz w:val="28"/>
-                                <w:szCs w:val="28"/>
-                              </w:rPr>
-                              <w:t xml:space="preserve"> run, </w:t>
-                            </w:r>
-                            <w:proofErr w:type="spellStart"/>
-                            <w:r>
-                              <w:rPr>
-                                <w:rFonts w:asciiTheme="majorBidi" w:hAnsiTheme="majorBidi" w:cstheme="majorBidi"/>
-                                <w:b/>
-                                <w:bCs/>
-                                <w:i/>
-                                <w:iCs/>
-                                <w:sz w:val="28"/>
-                                <w:szCs w:val="28"/>
-                              </w:rPr>
-                              <w:t>kubectl</w:t>
-                            </w:r>
-                            <w:proofErr w:type="spellEnd"/>
-                            <w:r>
-                              <w:rPr>
-                                <w:rFonts w:asciiTheme="majorBidi" w:hAnsiTheme="majorBidi" w:cstheme="majorBidi"/>
-                                <w:b/>
-                                <w:bCs/>
-                                <w:i/>
-                                <w:iCs/>
-                                <w:sz w:val="28"/>
-                                <w:szCs w:val="28"/>
-                              </w:rPr>
-                              <w:t xml:space="preserve"> scale</w:t>
+                              <w:t>kubectl run, kubectl scale</w:t>
                             </w:r>
                           </w:p>
                           <w:p>
@@ -11000,7 +11219,6 @@
                           <w:szCs w:val="28"/>
                         </w:rPr>
                       </w:pPr>
-                      <w:proofErr w:type="spellStart"/>
                       <w:r>
                         <w:rPr>
                           <w:rFonts w:asciiTheme="majorBidi" w:hAnsiTheme="majorBidi" w:cstheme="majorBidi"/>
@@ -11011,20 +11229,7 @@
                           <w:sz w:val="28"/>
                           <w:szCs w:val="28"/>
                         </w:rPr>
-                        <w:t>kubectl</w:t>
-                      </w:r>
-                      <w:proofErr w:type="spellEnd"/>
-                      <w:r>
-                        <w:rPr>
-                          <w:rFonts w:asciiTheme="majorBidi" w:hAnsiTheme="majorBidi" w:cstheme="majorBidi"/>
-                          <w:b/>
-                          <w:bCs/>
-                          <w:i/>
-                          <w:iCs/>
-                          <w:sz w:val="28"/>
-                          <w:szCs w:val="28"/>
-                        </w:rPr>
-                        <w:t xml:space="preserve"> scale deployment nginx --replicas=3</w:t>
+                        <w:t>kubectl scale deployment nginx --replicas=3</w:t>
                       </w:r>
                       <w:r>
                         <w:rPr>
@@ -11310,7 +11515,6 @@
                         </w:rPr>
                         <w:t xml:space="preserve">→ </w:t>
                       </w:r>
-                      <w:proofErr w:type="spellStart"/>
                       <w:r>
                         <w:rPr>
                           <w:rFonts w:asciiTheme="majorBidi" w:hAnsiTheme="majorBidi" w:cstheme="majorBidi"/>
@@ -11321,23 +11525,8 @@
                           <w:sz w:val="28"/>
                           <w:szCs w:val="28"/>
                         </w:rPr>
-                        <w:t>kubectl</w:t>
+                        <w:t xml:space="preserve">kubectl apply -f </w:t>
                       </w:r>
-                      <w:proofErr w:type="spellEnd"/>
-                      <w:r>
-                        <w:rPr>
-                          <w:rFonts w:asciiTheme="majorBidi" w:hAnsiTheme="majorBidi" w:cstheme="majorBidi"/>
-                          <w:b/>
-                          <w:bCs/>
-                          <w:i/>
-                          <w:iCs/>
-                          <w:sz w:val="28"/>
-                          <w:szCs w:val="28"/>
-                        </w:rPr>
-                        <w:t xml:space="preserve"> apply -f </w:t>
-                      </w:r>
-                      <w:proofErr w:type="spellStart"/>
-                      <w:proofErr w:type="gramStart"/>
                       <w:r>
                         <w:rPr>
                           <w:rFonts w:asciiTheme="majorBidi" w:hAnsiTheme="majorBidi" w:cstheme="majorBidi"/>
@@ -11350,8 +11539,6 @@
                         </w:rPr>
                         <w:t>deployment.yaml</w:t>
                       </w:r>
-                      <w:proofErr w:type="spellEnd"/>
-                      <w:proofErr w:type="gramEnd"/>
                     </w:p>
                     <w:p>
                       <w:pPr>
@@ -11446,23 +11633,13 @@
                           <w:szCs w:val="28"/>
                         </w:rPr>
                       </w:pPr>
-                      <w:proofErr w:type="gramStart"/>
                       <w:r>
                         <w:rPr>
                           <w:rFonts w:asciiTheme="majorBidi" w:hAnsiTheme="majorBidi" w:cstheme="majorBidi"/>
                           <w:sz w:val="28"/>
                           <w:szCs w:val="28"/>
                         </w:rPr>
-                        <w:t>So</w:t>
-                      </w:r>
-                      <w:proofErr w:type="gramEnd"/>
-                      <w:r>
-                        <w:rPr>
-                          <w:rFonts w:asciiTheme="majorBidi" w:hAnsiTheme="majorBidi" w:cstheme="majorBidi"/>
-                          <w:sz w:val="28"/>
-                          <w:szCs w:val="28"/>
-                        </w:rPr>
-                        <w:t xml:space="preserve"> declarative = “This is the state I want.”</w:t>
+                        <w:t>So declarative = “This is the state I want.”</w:t>
                       </w:r>
                     </w:p>
                     <w:p>
@@ -11590,7 +11767,6 @@
                         </w:rPr>
                         <w:t xml:space="preserve">Example: </w:t>
                       </w:r>
-                      <w:proofErr w:type="spellStart"/>
                       <w:r>
                         <w:rPr>
                           <w:rFonts w:asciiTheme="majorBidi" w:hAnsiTheme="majorBidi" w:cstheme="majorBidi"/>
@@ -11601,46 +11777,7 @@
                           <w:sz w:val="28"/>
                           <w:szCs w:val="28"/>
                         </w:rPr>
-                        <w:t>kubectl</w:t>
-                      </w:r>
-                      <w:proofErr w:type="spellEnd"/>
-                      <w:r>
-                        <w:rPr>
-                          <w:rFonts w:asciiTheme="majorBidi" w:hAnsiTheme="majorBidi" w:cstheme="majorBidi"/>
-                          <w:b/>
-                          <w:bCs/>
-                          <w:i/>
-                          <w:iCs/>
-                          <w:sz w:val="28"/>
-                          <w:szCs w:val="28"/>
-                        </w:rPr>
-                        <w:t xml:space="preserve"> run, </w:t>
-                      </w:r>
-                      <w:proofErr w:type="spellStart"/>
-                      <w:r>
-                        <w:rPr>
-                          <w:rFonts w:asciiTheme="majorBidi" w:hAnsiTheme="majorBidi" w:cstheme="majorBidi"/>
-                          <w:b/>
-                          <w:bCs/>
-                          <w:i/>
-                          <w:iCs/>
-                          <w:sz w:val="28"/>
-                          <w:szCs w:val="28"/>
-                        </w:rPr>
-                        <w:t>kubectl</w:t>
-                      </w:r>
-                      <w:proofErr w:type="spellEnd"/>
-                      <w:r>
-                        <w:rPr>
-                          <w:rFonts w:asciiTheme="majorBidi" w:hAnsiTheme="majorBidi" w:cstheme="majorBidi"/>
-                          <w:b/>
-                          <w:bCs/>
-                          <w:i/>
-                          <w:iCs/>
-                          <w:sz w:val="28"/>
-                          <w:szCs w:val="28"/>
-                        </w:rPr>
-                        <w:t xml:space="preserve"> scale</w:t>
+                        <w:t>kubectl run, kubectl scale</w:t>
                       </w:r>
                     </w:p>
                     <w:p>
@@ -11848,7 +11985,6 @@
                                 <w:szCs w:val="28"/>
                               </w:rPr>
                             </w:pPr>
-                            <w:proofErr w:type="spellStart"/>
                             <w:r>
                               <w:rPr>
                                 <w:rFonts w:asciiTheme="majorBidi" w:hAnsiTheme="majorBidi" w:cstheme="majorBidi"/>
@@ -11859,20 +11995,7 @@
                                 <w:sz w:val="28"/>
                                 <w:szCs w:val="28"/>
                               </w:rPr>
-                              <w:t>apiVersion</w:t>
-                            </w:r>
-                            <w:proofErr w:type="spellEnd"/>
-                            <w:r>
-                              <w:rPr>
-                                <w:rFonts w:asciiTheme="majorBidi" w:hAnsiTheme="majorBidi" w:cstheme="majorBidi"/>
-                                <w:b/>
-                                <w:bCs/>
-                                <w:i/>
-                                <w:iCs/>
-                                <w:sz w:val="28"/>
-                                <w:szCs w:val="28"/>
-                              </w:rPr>
-                              <w:t>: apps/v1</w:t>
+                              <w:t>apiVersion: apps/v1</w:t>
                             </w:r>
                           </w:p>
                           <w:p>
@@ -11950,19 +12073,7 @@
                                 <w:sz w:val="28"/>
                                 <w:szCs w:val="28"/>
                               </w:rPr>
-                              <w:t xml:space="preserve">     </w:t>
-                            </w:r>
-                            <w:r>
-                              <w:rPr>
-                                <w:rFonts w:asciiTheme="majorBidi" w:hAnsiTheme="majorBidi" w:cstheme="majorBidi"/>
-                                <w:b/>
-                                <w:bCs/>
-                                <w:i/>
-                                <w:iCs/>
-                                <w:sz w:val="28"/>
-                                <w:szCs w:val="28"/>
-                              </w:rPr>
-                              <w:t>name: nginx-deployment</w:t>
+                              <w:t xml:space="preserve">     name: nginx-deployment</w:t>
                             </w:r>
                           </w:p>
                           <w:p>
@@ -12066,33 +12177,7 @@
                                 <w:sz w:val="28"/>
                                 <w:szCs w:val="28"/>
                               </w:rPr>
-                              <w:t xml:space="preserve">     </w:t>
-                            </w:r>
-                            <w:proofErr w:type="spellStart"/>
-                            <w:r>
-                              <w:rPr>
-                                <w:rFonts w:asciiTheme="majorBidi" w:hAnsiTheme="majorBidi" w:cstheme="majorBidi"/>
-                                <w:b/>
-                                <w:bCs/>
-                                <w:i/>
-                                <w:iCs/>
-                                <w:sz w:val="28"/>
-                                <w:szCs w:val="28"/>
-                              </w:rPr>
-                              <w:t>matchLabels</w:t>
-                            </w:r>
-                            <w:proofErr w:type="spellEnd"/>
-                            <w:r>
-                              <w:rPr>
-                                <w:rFonts w:asciiTheme="majorBidi" w:hAnsiTheme="majorBidi" w:cstheme="majorBidi"/>
-                                <w:b/>
-                                <w:bCs/>
-                                <w:i/>
-                                <w:iCs/>
-                                <w:sz w:val="28"/>
-                                <w:szCs w:val="28"/>
-                              </w:rPr>
-                              <w:t>:</w:t>
+                              <w:t xml:space="preserve">     matchLabels:</w:t>
                             </w:r>
                           </w:p>
                           <w:p>
@@ -12118,31 +12203,7 @@
                                 <w:sz w:val="28"/>
                                 <w:szCs w:val="28"/>
                               </w:rPr>
-                              <w:t xml:space="preserve">     </w:t>
-                            </w:r>
-                            <w:r>
-                              <w:rPr>
-                                <w:rFonts w:asciiTheme="majorBidi" w:hAnsiTheme="majorBidi" w:cstheme="majorBidi"/>
-                                <w:b/>
-                                <w:bCs/>
-                                <w:i/>
-                                <w:iCs/>
-                                <w:sz w:val="28"/>
-                                <w:szCs w:val="28"/>
-                              </w:rPr>
-                              <w:t xml:space="preserve">     </w:t>
-                            </w:r>
-                            <w:r>
-                              <w:rPr>
-                                <w:rFonts w:asciiTheme="majorBidi" w:hAnsiTheme="majorBidi" w:cstheme="majorBidi"/>
-                                <w:b/>
-                                <w:bCs/>
-                                <w:i/>
-                                <w:iCs/>
-                                <w:sz w:val="28"/>
-                                <w:szCs w:val="28"/>
-                              </w:rPr>
-                              <w:t>app: nginx</w:t>
+                              <w:t xml:space="preserve">          app: nginx</w:t>
                             </w:r>
                           </w:p>
                           <w:p>
@@ -12194,31 +12255,7 @@
                                 <w:sz w:val="28"/>
                                 <w:szCs w:val="28"/>
                               </w:rPr>
-                              <w:t xml:space="preserve">     </w:t>
-                            </w:r>
-                            <w:r>
-                              <w:rPr>
-                                <w:rFonts w:asciiTheme="majorBidi" w:hAnsiTheme="majorBidi" w:cstheme="majorBidi"/>
-                                <w:b/>
-                                <w:bCs/>
-                                <w:i/>
-                                <w:iCs/>
-                                <w:sz w:val="28"/>
-                                <w:szCs w:val="28"/>
-                              </w:rPr>
-                              <w:t xml:space="preserve">     </w:t>
-                            </w:r>
-                            <w:r>
-                              <w:rPr>
-                                <w:rFonts w:asciiTheme="majorBidi" w:hAnsiTheme="majorBidi" w:cstheme="majorBidi"/>
-                                <w:b/>
-                                <w:bCs/>
-                                <w:i/>
-                                <w:iCs/>
-                                <w:sz w:val="28"/>
-                                <w:szCs w:val="28"/>
-                              </w:rPr>
-                              <w:t>metadata:</w:t>
+                              <w:t xml:space="preserve">          metadata:</w:t>
                             </w:r>
                           </w:p>
                           <w:p>
@@ -12244,31 +12281,7 @@
                                 <w:sz w:val="28"/>
                                 <w:szCs w:val="28"/>
                               </w:rPr>
-                              <w:t xml:space="preserve">          </w:t>
-                            </w:r>
-                            <w:r>
-                              <w:rPr>
-                                <w:rFonts w:asciiTheme="majorBidi" w:hAnsiTheme="majorBidi" w:cstheme="majorBidi"/>
-                                <w:b/>
-                                <w:bCs/>
-                                <w:i/>
-                                <w:iCs/>
-                                <w:sz w:val="28"/>
-                                <w:szCs w:val="28"/>
-                              </w:rPr>
-                              <w:t xml:space="preserve">     </w:t>
-                            </w:r>
-                            <w:r>
-                              <w:rPr>
-                                <w:rFonts w:asciiTheme="majorBidi" w:hAnsiTheme="majorBidi" w:cstheme="majorBidi"/>
-                                <w:b/>
-                                <w:bCs/>
-                                <w:i/>
-                                <w:iCs/>
-                                <w:sz w:val="28"/>
-                                <w:szCs w:val="28"/>
-                              </w:rPr>
-                              <w:t>labels:</w:t>
+                              <w:t xml:space="preserve">               labels:</w:t>
                             </w:r>
                           </w:p>
                           <w:p>
@@ -12294,31 +12307,7 @@
                                 <w:sz w:val="28"/>
                                 <w:szCs w:val="28"/>
                               </w:rPr>
-                              <w:t xml:space="preserve">               </w:t>
-                            </w:r>
-                            <w:r>
-                              <w:rPr>
-                                <w:rFonts w:asciiTheme="majorBidi" w:hAnsiTheme="majorBidi" w:cstheme="majorBidi"/>
-                                <w:b/>
-                                <w:bCs/>
-                                <w:i/>
-                                <w:iCs/>
-                                <w:sz w:val="28"/>
-                                <w:szCs w:val="28"/>
-                              </w:rPr>
-                              <w:t xml:space="preserve">     </w:t>
-                            </w:r>
-                            <w:r>
-                              <w:rPr>
-                                <w:rFonts w:asciiTheme="majorBidi" w:hAnsiTheme="majorBidi" w:cstheme="majorBidi"/>
-                                <w:b/>
-                                <w:bCs/>
-                                <w:i/>
-                                <w:iCs/>
-                                <w:sz w:val="28"/>
-                                <w:szCs w:val="28"/>
-                              </w:rPr>
-                              <w:t>app: nginx</w:t>
+                              <w:t xml:space="preserve">                    app: nginx</w:t>
                             </w:r>
                           </w:p>
                           <w:p>
@@ -12458,19 +12447,7 @@
                                 <w:sz w:val="28"/>
                                 <w:szCs w:val="28"/>
                               </w:rPr>
-                              <w:t xml:space="preserve">          </w:t>
-                            </w:r>
-                            <w:r>
-                              <w:rPr>
-                                <w:rFonts w:asciiTheme="majorBidi" w:hAnsiTheme="majorBidi" w:cstheme="majorBidi"/>
-                                <w:b/>
-                                <w:bCs/>
-                                <w:i/>
-                                <w:iCs/>
-                                <w:sz w:val="28"/>
-                                <w:szCs w:val="28"/>
-                              </w:rPr>
-                              <w:t xml:space="preserve">      </w:t>
+                              <w:t xml:space="preserve">                </w:t>
                             </w:r>
                             <w:r>
                               <w:rPr>
@@ -12535,7 +12512,6 @@
                           <w:szCs w:val="28"/>
                         </w:rPr>
                       </w:pPr>
-                      <w:proofErr w:type="spellStart"/>
                       <w:r>
                         <w:rPr>
                           <w:rFonts w:asciiTheme="majorBidi" w:hAnsiTheme="majorBidi" w:cstheme="majorBidi"/>
@@ -12546,20 +12522,7 @@
                           <w:sz w:val="28"/>
                           <w:szCs w:val="28"/>
                         </w:rPr>
-                        <w:t>apiVersion</w:t>
-                      </w:r>
-                      <w:proofErr w:type="spellEnd"/>
-                      <w:r>
-                        <w:rPr>
-                          <w:rFonts w:asciiTheme="majorBidi" w:hAnsiTheme="majorBidi" w:cstheme="majorBidi"/>
-                          <w:b/>
-                          <w:bCs/>
-                          <w:i/>
-                          <w:iCs/>
-                          <w:sz w:val="28"/>
-                          <w:szCs w:val="28"/>
-                        </w:rPr>
-                        <w:t>: apps/v1</w:t>
+                        <w:t>apiVersion: apps/v1</w:t>
                       </w:r>
                     </w:p>
                     <w:p>
@@ -12637,19 +12600,7 @@
                           <w:sz w:val="28"/>
                           <w:szCs w:val="28"/>
                         </w:rPr>
-                        <w:t xml:space="preserve">     </w:t>
-                      </w:r>
-                      <w:r>
-                        <w:rPr>
-                          <w:rFonts w:asciiTheme="majorBidi" w:hAnsiTheme="majorBidi" w:cstheme="majorBidi"/>
-                          <w:b/>
-                          <w:bCs/>
-                          <w:i/>
-                          <w:iCs/>
-                          <w:sz w:val="28"/>
-                          <w:szCs w:val="28"/>
-                        </w:rPr>
-                        <w:t>name: nginx-deployment</w:t>
+                        <w:t xml:space="preserve">     name: nginx-deployment</w:t>
                       </w:r>
                     </w:p>
                     <w:p>
@@ -12753,33 +12704,7 @@
                           <w:sz w:val="28"/>
                           <w:szCs w:val="28"/>
                         </w:rPr>
-                        <w:t xml:space="preserve">     </w:t>
-                      </w:r>
-                      <w:proofErr w:type="spellStart"/>
-                      <w:r>
-                        <w:rPr>
-                          <w:rFonts w:asciiTheme="majorBidi" w:hAnsiTheme="majorBidi" w:cstheme="majorBidi"/>
-                          <w:b/>
-                          <w:bCs/>
-                          <w:i/>
-                          <w:iCs/>
-                          <w:sz w:val="28"/>
-                          <w:szCs w:val="28"/>
-                        </w:rPr>
-                        <w:t>matchLabels</w:t>
-                      </w:r>
-                      <w:proofErr w:type="spellEnd"/>
-                      <w:r>
-                        <w:rPr>
-                          <w:rFonts w:asciiTheme="majorBidi" w:hAnsiTheme="majorBidi" w:cstheme="majorBidi"/>
-                          <w:b/>
-                          <w:bCs/>
-                          <w:i/>
-                          <w:iCs/>
-                          <w:sz w:val="28"/>
-                          <w:szCs w:val="28"/>
-                        </w:rPr>
-                        <w:t>:</w:t>
+                        <w:t xml:space="preserve">     matchLabels:</w:t>
                       </w:r>
                     </w:p>
                     <w:p>
@@ -12805,31 +12730,7 @@
                           <w:sz w:val="28"/>
                           <w:szCs w:val="28"/>
                         </w:rPr>
-                        <w:t xml:space="preserve">     </w:t>
-                      </w:r>
-                      <w:r>
-                        <w:rPr>
-                          <w:rFonts w:asciiTheme="majorBidi" w:hAnsiTheme="majorBidi" w:cstheme="majorBidi"/>
-                          <w:b/>
-                          <w:bCs/>
-                          <w:i/>
-                          <w:iCs/>
-                          <w:sz w:val="28"/>
-                          <w:szCs w:val="28"/>
-                        </w:rPr>
-                        <w:t xml:space="preserve">     </w:t>
-                      </w:r>
-                      <w:r>
-                        <w:rPr>
-                          <w:rFonts w:asciiTheme="majorBidi" w:hAnsiTheme="majorBidi" w:cstheme="majorBidi"/>
-                          <w:b/>
-                          <w:bCs/>
-                          <w:i/>
-                          <w:iCs/>
-                          <w:sz w:val="28"/>
-                          <w:szCs w:val="28"/>
-                        </w:rPr>
-                        <w:t>app: nginx</w:t>
+                        <w:t xml:space="preserve">          app: nginx</w:t>
                       </w:r>
                     </w:p>
                     <w:p>
@@ -12881,31 +12782,7 @@
                           <w:sz w:val="28"/>
                           <w:szCs w:val="28"/>
                         </w:rPr>
-                        <w:t xml:space="preserve">     </w:t>
-                      </w:r>
-                      <w:r>
-                        <w:rPr>
-                          <w:rFonts w:asciiTheme="majorBidi" w:hAnsiTheme="majorBidi" w:cstheme="majorBidi"/>
-                          <w:b/>
-                          <w:bCs/>
-                          <w:i/>
-                          <w:iCs/>
-                          <w:sz w:val="28"/>
-                          <w:szCs w:val="28"/>
-                        </w:rPr>
-                        <w:t xml:space="preserve">     </w:t>
-                      </w:r>
-                      <w:r>
-                        <w:rPr>
-                          <w:rFonts w:asciiTheme="majorBidi" w:hAnsiTheme="majorBidi" w:cstheme="majorBidi"/>
-                          <w:b/>
-                          <w:bCs/>
-                          <w:i/>
-                          <w:iCs/>
-                          <w:sz w:val="28"/>
-                          <w:szCs w:val="28"/>
-                        </w:rPr>
-                        <w:t>metadata:</w:t>
+                        <w:t xml:space="preserve">          metadata:</w:t>
                       </w:r>
                     </w:p>
                     <w:p>
@@ -12931,31 +12808,7 @@
                           <w:sz w:val="28"/>
                           <w:szCs w:val="28"/>
                         </w:rPr>
-                        <w:t xml:space="preserve">          </w:t>
-                      </w:r>
-                      <w:r>
-                        <w:rPr>
-                          <w:rFonts w:asciiTheme="majorBidi" w:hAnsiTheme="majorBidi" w:cstheme="majorBidi"/>
-                          <w:b/>
-                          <w:bCs/>
-                          <w:i/>
-                          <w:iCs/>
-                          <w:sz w:val="28"/>
-                          <w:szCs w:val="28"/>
-                        </w:rPr>
-                        <w:t xml:space="preserve">     </w:t>
-                      </w:r>
-                      <w:r>
-                        <w:rPr>
-                          <w:rFonts w:asciiTheme="majorBidi" w:hAnsiTheme="majorBidi" w:cstheme="majorBidi"/>
-                          <w:b/>
-                          <w:bCs/>
-                          <w:i/>
-                          <w:iCs/>
-                          <w:sz w:val="28"/>
-                          <w:szCs w:val="28"/>
-                        </w:rPr>
-                        <w:t>labels:</w:t>
+                        <w:t xml:space="preserve">               labels:</w:t>
                       </w:r>
                     </w:p>
                     <w:p>
@@ -12981,31 +12834,7 @@
                           <w:sz w:val="28"/>
                           <w:szCs w:val="28"/>
                         </w:rPr>
-                        <w:t xml:space="preserve">               </w:t>
-                      </w:r>
-                      <w:r>
-                        <w:rPr>
-                          <w:rFonts w:asciiTheme="majorBidi" w:hAnsiTheme="majorBidi" w:cstheme="majorBidi"/>
-                          <w:b/>
-                          <w:bCs/>
-                          <w:i/>
-                          <w:iCs/>
-                          <w:sz w:val="28"/>
-                          <w:szCs w:val="28"/>
-                        </w:rPr>
-                        <w:t xml:space="preserve">     </w:t>
-                      </w:r>
-                      <w:r>
-                        <w:rPr>
-                          <w:rFonts w:asciiTheme="majorBidi" w:hAnsiTheme="majorBidi" w:cstheme="majorBidi"/>
-                          <w:b/>
-                          <w:bCs/>
-                          <w:i/>
-                          <w:iCs/>
-                          <w:sz w:val="28"/>
-                          <w:szCs w:val="28"/>
-                        </w:rPr>
-                        <w:t>app: nginx</w:t>
+                        <w:t xml:space="preserve">                    app: nginx</w:t>
                       </w:r>
                     </w:p>
                     <w:p>
@@ -13145,19 +12974,7 @@
                           <w:sz w:val="28"/>
                           <w:szCs w:val="28"/>
                         </w:rPr>
-                        <w:t xml:space="preserve">          </w:t>
-                      </w:r>
-                      <w:r>
-                        <w:rPr>
-                          <w:rFonts w:asciiTheme="majorBidi" w:hAnsiTheme="majorBidi" w:cstheme="majorBidi"/>
-                          <w:b/>
-                          <w:bCs/>
-                          <w:i/>
-                          <w:iCs/>
-                          <w:sz w:val="28"/>
-                          <w:szCs w:val="28"/>
-                        </w:rPr>
-                        <w:t xml:space="preserve">      </w:t>
+                        <w:t xml:space="preserve">                </w:t>
                       </w:r>
                       <w:r>
                         <w:rPr>
@@ -13408,7 +13225,6 @@
           <w:sz w:val="28"/>
           <w:szCs w:val="28"/>
         </w:rPr>
-        <w:lastRenderedPageBreak/>
         <mc:AlternateContent>
           <mc:Choice Requires="wps">
             <w:drawing>
@@ -13549,7 +13365,6 @@
                               </w:rPr>
                               <w:t xml:space="preserve">Example: </w:t>
                             </w:r>
-                            <w:proofErr w:type="spellStart"/>
                             <w:r>
                               <w:rPr>
                                 <w:rFonts w:asciiTheme="majorBidi" w:hAnsiTheme="majorBidi" w:cstheme="majorBidi"/>
@@ -13560,37 +13375,8 @@
                                 <w:sz w:val="28"/>
                                 <w:szCs w:val="28"/>
                               </w:rPr>
-                              <w:t>kubectl</w:t>
+                              <w:t>kubectl apply -f deployment.yaml</w:t>
                             </w:r>
-                            <w:proofErr w:type="spellEnd"/>
-                            <w:r>
-                              <w:rPr>
-                                <w:rFonts w:asciiTheme="majorBidi" w:hAnsiTheme="majorBidi" w:cstheme="majorBidi"/>
-                                <w:b/>
-                                <w:bCs/>
-                                <w:i/>
-                                <w:iCs/>
-                                <w:sz w:val="28"/>
-                                <w:szCs w:val="28"/>
-                              </w:rPr>
-                              <w:t xml:space="preserve"> apply -f </w:t>
-                            </w:r>
-                            <w:proofErr w:type="spellStart"/>
-                            <w:proofErr w:type="gramStart"/>
-                            <w:r>
-                              <w:rPr>
-                                <w:rFonts w:asciiTheme="majorBidi" w:hAnsiTheme="majorBidi" w:cstheme="majorBidi"/>
-                                <w:b/>
-                                <w:bCs/>
-                                <w:i/>
-                                <w:iCs/>
-                                <w:sz w:val="28"/>
-                                <w:szCs w:val="28"/>
-                              </w:rPr>
-                              <w:t>deployment.yaml</w:t>
-                            </w:r>
-                            <w:proofErr w:type="spellEnd"/>
-                            <w:proofErr w:type="gramEnd"/>
                           </w:p>
                           <w:p>
                             <w:pPr>
@@ -13775,25 +13561,7 @@
                                 <w:sz w:val="28"/>
                                 <w:szCs w:val="28"/>
                               </w:rPr>
-                              <w:t xml:space="preserve">Declarative → used in production environments, </w:t>
-                            </w:r>
-                            <w:proofErr w:type="spellStart"/>
-                            <w:r>
-                              <w:rPr>
-                                <w:rFonts w:asciiTheme="majorBidi" w:hAnsiTheme="majorBidi" w:cstheme="majorBidi"/>
-                                <w:sz w:val="28"/>
-                                <w:szCs w:val="28"/>
-                              </w:rPr>
-                              <w:t>GitOps</w:t>
-                            </w:r>
-                            <w:proofErr w:type="spellEnd"/>
-                            <w:r>
-                              <w:rPr>
-                                <w:rFonts w:asciiTheme="majorBidi" w:hAnsiTheme="majorBidi" w:cstheme="majorBidi"/>
-                                <w:sz w:val="28"/>
-                                <w:szCs w:val="28"/>
-                              </w:rPr>
-                              <w:t>, CI/CD</w:t>
+                              <w:t>Declarative → used in production environments, GitOps, CI/CD</w:t>
                             </w:r>
                           </w:p>
                           <w:p>
@@ -13936,7 +13704,6 @@
                         </w:rPr>
                         <w:t xml:space="preserve">Example: </w:t>
                       </w:r>
-                      <w:proofErr w:type="spellStart"/>
                       <w:r>
                         <w:rPr>
                           <w:rFonts w:asciiTheme="majorBidi" w:hAnsiTheme="majorBidi" w:cstheme="majorBidi"/>
@@ -13947,23 +13714,8 @@
                           <w:sz w:val="28"/>
                           <w:szCs w:val="28"/>
                         </w:rPr>
-                        <w:t>kubectl</w:t>
+                        <w:t xml:space="preserve">kubectl apply -f </w:t>
                       </w:r>
-                      <w:proofErr w:type="spellEnd"/>
-                      <w:r>
-                        <w:rPr>
-                          <w:rFonts w:asciiTheme="majorBidi" w:hAnsiTheme="majorBidi" w:cstheme="majorBidi"/>
-                          <w:b/>
-                          <w:bCs/>
-                          <w:i/>
-                          <w:iCs/>
-                          <w:sz w:val="28"/>
-                          <w:szCs w:val="28"/>
-                        </w:rPr>
-                        <w:t xml:space="preserve"> apply -f </w:t>
-                      </w:r>
-                      <w:proofErr w:type="spellStart"/>
-                      <w:proofErr w:type="gramStart"/>
                       <w:r>
                         <w:rPr>
                           <w:rFonts w:asciiTheme="majorBidi" w:hAnsiTheme="majorBidi" w:cstheme="majorBidi"/>
@@ -13976,8 +13728,6 @@
                         </w:rPr>
                         <w:t>deployment.yaml</w:t>
                       </w:r>
-                      <w:proofErr w:type="spellEnd"/>
-                      <w:proofErr w:type="gramEnd"/>
                     </w:p>
                     <w:p>
                       <w:pPr>
@@ -14162,25 +13912,7 @@
                           <w:sz w:val="28"/>
                           <w:szCs w:val="28"/>
                         </w:rPr>
-                        <w:t xml:space="preserve">Declarative → used in production environments, </w:t>
-                      </w:r>
-                      <w:proofErr w:type="spellStart"/>
-                      <w:r>
-                        <w:rPr>
-                          <w:rFonts w:asciiTheme="majorBidi" w:hAnsiTheme="majorBidi" w:cstheme="majorBidi"/>
-                          <w:sz w:val="28"/>
-                          <w:szCs w:val="28"/>
-                        </w:rPr>
-                        <w:t>GitOps</w:t>
-                      </w:r>
-                      <w:proofErr w:type="spellEnd"/>
-                      <w:r>
-                        <w:rPr>
-                          <w:rFonts w:asciiTheme="majorBidi" w:hAnsiTheme="majorBidi" w:cstheme="majorBidi"/>
-                          <w:sz w:val="28"/>
-                          <w:szCs w:val="28"/>
-                        </w:rPr>
-                        <w:t>, CI/CD</w:t>
+                        <w:t>Declarative → used in production environments, GitOps, CI/CD</w:t>
                       </w:r>
                     </w:p>
                     <w:p>

</xml_diff>